<commit_message>
Atualizacao de fotos análise de mercado e concorrentes
</commit_message>
<xml_diff>
--- a/entrega1_AP/Análise de Mercado e Concorrentes.docx
+++ b/entrega1_AP/Análise de Mercado e Concorrentes.docx
@@ -1,36 +1,34 @@
 
 <file path=word/document.xml><?xml version="1.0" encoding="utf-8"?>
-<w:document xmlns:wpc="http://schemas.microsoft.com/office/word/2010/wordprocessingCanvas" xmlns:mc="http://schemas.openxmlformats.org/markup-compatibility/2006" xmlns:o="urn:schemas-microsoft-com:office:office" xmlns:r="http://schemas.openxmlformats.org/officeDocument/2006/relationships" xmlns:m="http://schemas.openxmlformats.org/officeDocument/2006/math" xmlns:v="urn:schemas-microsoft-com:vml" xmlns:wp="http://schemas.openxmlformats.org/drawingml/2006/wordprocessingDrawing" xmlns:w="http://schemas.openxmlformats.org/wordprocessingml/2006/main" xmlns:wpg="http://schemas.microsoft.com/office/word/2010/wordprocessingGroup" xmlns:wpi="http://schemas.microsoft.com/office/word/2010/wordprocessingInk" xmlns:a="http://schemas.openxmlformats.org/drawingml/2006/main" xmlns:wne="http://schemas.microsoft.com/office/word/2006/wordml" xmlns:wps="http://schemas.microsoft.com/office/word/2010/wordprocessingShape" xmlns:w10="urn:schemas-microsoft-com:office:word" xmlns:wp14="http://schemas.microsoft.com/office/word/2010/wordprocessingDrawing" xmlns:w14="http://schemas.microsoft.com/office/word/2010/wordml" xmlns:w15="http://schemas.microsoft.com/office/word/2012/wordml" xmlns:w16cex="http://schemas.microsoft.com/office/word/2018/wordml/cex" xmlns:w16cid="http://schemas.microsoft.com/office/word/2016/wordml/cid" xmlns:w16="http://schemas.microsoft.com/office/word/2018/wordml" xmlns:w16sdtdh="http://schemas.microsoft.com/office/word/2020/wordml/sdtdatahash" xmlns:w16se="http://schemas.microsoft.com/office/word/2015/wordml/symex" mc:Ignorable="w14 w15 w16se w16cid w16 w16cex w16sdtdh wp14">
+<w:document xmlns:wpc="http://schemas.microsoft.com/office/word/2010/wordprocessingCanvas" xmlns:mc="http://schemas.openxmlformats.org/markup-compatibility/2006" xmlns:o="urn:schemas-microsoft-com:office:office" xmlns:r="http://schemas.openxmlformats.org/officeDocument/2006/relationships" xmlns:m="http://schemas.openxmlformats.org/officeDocument/2006/math" xmlns:v="urn:schemas-microsoft-com:vml" xmlns:wp="http://schemas.openxmlformats.org/drawingml/2006/wordprocessingDrawing" xmlns:w="http://schemas.openxmlformats.org/wordprocessingml/2006/main" xmlns:wpg="http://schemas.microsoft.com/office/word/2010/wordprocessingGroup" xmlns:wpi="http://schemas.microsoft.com/office/word/2010/wordprocessingInk" xmlns:a="http://schemas.openxmlformats.org/drawingml/2006/main" xmlns:wne="http://schemas.microsoft.com/office/word/2006/wordml" xmlns:wps="http://schemas.microsoft.com/office/word/2010/wordprocessingShape" xmlns:w10="urn:schemas-microsoft-com:office:word" xmlns:wp14="http://schemas.microsoft.com/office/word/2010/wordprocessingDrawing" xmlns:w14="http://schemas.microsoft.com/office/word/2010/wordml" xmlns:w15="http://schemas.microsoft.com/office/word/2012/wordml" xmlns:w16cex="http://schemas.microsoft.com/office/word/2018/wordml/cex" xmlns:w16cid="http://schemas.microsoft.com/office/word/2016/wordml/cid" xmlns:w16="http://schemas.microsoft.com/office/word/2018/wordml" xmlns:w16sdtdh="http://schemas.microsoft.com/office/word/2020/wordml/sdtdatahash" xmlns:w16se="http://schemas.microsoft.com/office/word/2015/wordml/symex" xmlns:pic="http://schemas.openxmlformats.org/drawingml/2006/picture" xmlns:a14="http://schemas.microsoft.com/office/drawing/2010/main" mc:Ignorable="w14 w15 w16se w16cid w16 w16cex w16sdtdh wp14">
   <w:body>
-    <w:p>
+    <w:p xmlns:wp14="http://schemas.microsoft.com/office/word/2010/wordml" wp14:textId="77777777">
       <w:pPr>
         <w:pStyle w:val="683"/>
-        <w:keepNext w:val="false"/>
-        <w:keepLines w:val="false"/>
-        <w:pBdr/>
+        <w:keepNext w:val="0"/>
+        <w:keepLines w:val="0"/>
         <w:spacing w:before="0"/>
         <w:ind w:firstLine="720"/>
         <w:jc w:val="center"/>
         <w:rPr>
-          <w:b/>
-          <w:bCs/>
+          <w:b w:val="1"/>
+          <w:bCs w:val="1"/>
           <w:color w:val="000000"/>
           <w:sz w:val="26"/>
           <w:szCs w:val="26"/>
+          <w:lang w:val="en-US"/>
         </w:rPr>
       </w:pPr>
-      <w:r/>
-      <w:bookmarkStart w:id="0" w:name="_i4lmeolke8xb"/>
-      <w:r/>
+      <w:bookmarkStart w:name="_i4lmeolke8xb" w:id="0"/>
       <w:bookmarkEnd w:id="0"/>
       <w:r>
         <w:rPr>
-          <w:b/>
-          <w:bCs/>
+          <w:b w:val="1"/>
+          <w:bCs w:val="1"/>
           <w:color w:val="000000"/>
           <w:sz w:val="26"/>
           <w:szCs w:val="26"/>
-          <w:rtl w:val="0"/>
+          <w:lang w:val="en-US"/>
         </w:rPr>
         <w:t xml:space="preserve">Análise de Mercado e Concorrentes</w:t>
       </w:r>
@@ -44,71 +42,67 @@
         </w:rPr>
       </w:r>
     </w:p>
-    <w:p>
-      <w:pPr>
-        <w:pBdr/>
+    <w:p xmlns:wp14="http://schemas.microsoft.com/office/word/2010/wordml" wp14:textId="77777777">
+      <w:pPr>
         <w:spacing w:after="240"/>
         <w:ind/>
         <w:jc w:val="both"/>
-        <w:rPr/>
       </w:pPr>
       <w:r>
         <w:rPr>
-          <w:rtl w:val="0"/>
+          <w:lang w:val="en-US"/>
         </w:rPr>
         <w:t xml:space="preserve">Este documento faz parte da etapa de "Análise de mercado e Proposta inicial" da disciplina de Projeto e Desenvolvimento de Sistemas II. Nossa principal motivação com essa pesquisa foi entender como as ferramentas atuais de Gerenciamento de Reuniões (MMS — </w:t>
       </w:r>
       <w:r>
         <w:rPr>
-          <w:i/>
-          <w:iCs/>
-          <w:rtl w:val="0"/>
+          <w:i w:val="1"/>
+          <w:iCs w:val="1"/>
+          <w:lang w:val="en-US"/>
         </w:rPr>
         <w:t xml:space="preserve">Meeting Management System</w:t>
       </w:r>
       <w:r>
         <w:rPr>
-          <w:rtl w:val="0"/>
+          <w:lang w:val="en-US"/>
         </w:rPr>
         <w:t xml:space="preserve">, ou Sistema de Gerenciamento de Reuniões) tentam resolver o problema dos encontros improdutivos e, principalmente, descobrir onde elas dei</w:t>
       </w:r>
       <w:r>
         <w:rPr>
-          <w:rtl w:val="0"/>
+          <w:lang w:val="en-US"/>
         </w:rPr>
         <w:t xml:space="preserve">xam a desejar. Essa análise contribui para o nosso projeto permitindo ver de perto o que os concorrentes deixam de lacuna e o espaço que eles preenchem bem no mercado. Dessa forma, podemos direcionar melhor o escopo para o desenvolvimento do nosso sistema.</w:t>
       </w:r>
       <w:r/>
     </w:p>
-    <w:p>
+    <w:p xmlns:wp14="http://schemas.microsoft.com/office/word/2010/wordml" wp14:textId="77777777">
       <w:pPr>
         <w:pStyle w:val="684"/>
-        <w:keepNext w:val="false"/>
-        <w:keepLines w:val="false"/>
-        <w:pBdr/>
-        <w:spacing w:after="40" w:before="0"/>
+        <w:keepNext w:val="0"/>
+        <w:keepLines w:val="0"/>
+        <w:spacing w:before="0" w:after="40"/>
         <w:ind w:firstLine="0"/>
         <w:jc w:val="both"/>
         <w:rPr>
-          <w:b/>
-          <w:bCs/>
+          <w:b w:val="1"/>
+          <w:bCs w:val="1"/>
           <w:color w:val="000000"/>
           <w:sz w:val="22"/>
           <w:szCs w:val="22"/>
+          <w:lang w:val="en-US"/>
         </w:rPr>
       </w:pPr>
-      <w:r/>
-      <w:bookmarkStart w:id="1" w:name="_5ki7yy4f3nyb"/>
-      <w:r/>
+      <w:bookmarkStart w:name="_5ki7yy4f3nyb" w:id="1"/>
       <w:bookmarkEnd w:id="1"/>
       <w:r>
         <w:rPr>
-          <w:b/>
-          <w:bCs/>
+          <w:b w:val="1"/>
+          <w:bCs w:val="1"/>
           <w:color w:val="000000"/>
           <w:sz w:val="22"/>
           <w:szCs w:val="22"/>
-          <w:rtl w:val="0"/>
+          <w:lang w:val="en-US"/>
         </w:rPr>
         <w:t xml:space="preserve">Análise dos principais concorrentes:</w:t>
       </w:r>
@@ -122,7 +116,7 @@
         </w:rPr>
       </w:r>
     </w:p>
-    <w:p>
+    <w:p xmlns:wp14="http://schemas.microsoft.com/office/word/2010/wordml" wp14:textId="77777777">
       <w:pPr>
         <w:pBdr/>
         <w:spacing w:after="240"/>
@@ -148,87 +142,85 @@
         </w:rPr>
       </w:r>
     </w:p>
-    <w:p>
+    <w:p xmlns:wp14="http://schemas.microsoft.com/office/word/2010/wordml" wp14:textId="77777777">
       <w:pPr>
         <w:numPr>
           <w:ilvl w:val="0"/>
           <w:numId w:val="3"/>
         </w:numPr>
-        <w:pBdr/>
         <w:spacing w:after="0"/>
-        <w:ind w:hanging="360" w:left="720"/>
+        <w:ind w:left="720" w:hanging="360"/>
         <w:rPr/>
       </w:pPr>
       <w:r>
         <w:rPr>
-          <w:b/>
-          <w:bCs/>
-          <w:rtl w:val="0"/>
+          <w:b w:val="1"/>
+          <w:bCs w:val="1"/>
+          <w:lang w:val="en-US"/>
         </w:rPr>
         <w:t xml:space="preserve">Breve Descrição:</w:t>
       </w:r>
       <w:r>
         <w:rPr>
-          <w:rtl w:val="0"/>
+          <w:lang w:val="en-US"/>
         </w:rPr>
         <w:t xml:space="preserve"> Plataforma focada em organizar e</w:t>
       </w:r>
       <w:r>
         <w:rPr>
-          <w:rtl w:val="0"/>
+          <w:lang w:val="en-US"/>
         </w:rPr>
         <w:t xml:space="preserve"> gerenciar reuniões como um processo completo, ideal para empresas que demandam um histórico detalhado e organização estruturada. A ferramenta trata a reunião como um fluxo prático: preparar, realizar, registrar decisões, criar tarefas e acompanhar depois.</w:t>
       </w:r>
       <w:r/>
     </w:p>
-    <w:p>
+    <w:p xmlns:wp14="http://schemas.microsoft.com/office/word/2010/wordml" wp14:textId="77777777">
       <w:pPr>
         <w:numPr>
           <w:ilvl w:val="0"/>
           <w:numId w:val="3"/>
         </w:numPr>
-        <w:pBdr/>
         <w:spacing w:after="0"/>
-        <w:ind w:hanging="360" w:left="720"/>
+        <w:ind w:left="720" w:hanging="360"/>
         <w:rPr/>
       </w:pPr>
       <w:r>
         <w:rPr>
-          <w:b/>
-          <w:bCs/>
-          <w:rtl w:val="0"/>
+          <w:b w:val="1"/>
+          <w:bCs w:val="1"/>
+          <w:lang w:val="en-US"/>
         </w:rPr>
         <w:t xml:space="preserve">Diferencial de Destaque:</w:t>
       </w:r>
       <w:r>
         <w:rPr>
-          <w:rtl w:val="0"/>
+          <w:lang w:val="en-US"/>
         </w:rPr>
         <w:t xml:space="preserve"> </w:t>
       </w:r>
       <w:r>
         <w:rPr>
-          <w:i/>
-          <w:iCs/>
-          <w:rtl w:val="0"/>
+          <w:i w:val="1"/>
+          <w:iCs w:val="1"/>
+          <w:lang w:val="en-US"/>
         </w:rPr>
         <w:t xml:space="preserve">Metodologia Própria e Reunião como Processo.</w:t>
       </w:r>
       <w:r>
         <w:rPr>
-          <w:rtl w:val="0"/>
+          <w:lang w:val="en-US"/>
         </w:rPr>
         <w:t xml:space="preserve"> Em vez de ser apenas um bloco de notas compartilhado, o Lucid Meetings impõe um ciclo de vida rigoroso para cada encontro e po</w:t>
       </w:r>
       <w:r>
         <w:rPr>
-          <w:rtl w:val="0"/>
+          <w:lang w:val="en-US"/>
         </w:rPr>
         <w:t xml:space="preserve">ssui uma metodologia própria embutida. Ele transforma a reunião em um processo corporativo auditável, guiando as equipes para que não pulem etapas, o que garante que toda reunião tenha um começo planejado (agenda) e um fim documentado (decisões e tarefas).</w:t>
       </w:r>
       <w:r/>
     </w:p>
-    <w:p>
+    <w:p xmlns:wp14="http://schemas.microsoft.com/office/word/2010/wordml" wp14:textId="77777777">
       <w:pPr>
         <w:numPr>
           <w:ilvl w:val="0"/>
@@ -236,7 +228,7 @@
         </w:numPr>
         <w:pBdr/>
         <w:spacing w:after="0"/>
-        <w:ind w:hanging="360" w:left="720"/>
+        <w:ind w:left="720" w:hanging="360"/>
         <w:rPr/>
       </w:pPr>
       <w:r>
@@ -254,93 +246,89 @@
       </w:r>
       <w:r/>
     </w:p>
-    <w:p>
+    <w:p xmlns:wp14="http://schemas.microsoft.com/office/word/2010/wordml" wp14:textId="77777777">
       <w:pPr>
         <w:numPr>
           <w:ilvl w:val="1"/>
           <w:numId w:val="3"/>
         </w:numPr>
-        <w:pBdr/>
         <w:spacing w:after="0"/>
-        <w:ind w:hanging="360" w:left="1440"/>
+        <w:ind w:left="1440" w:hanging="360"/>
         <w:rPr/>
       </w:pPr>
       <w:r>
         <w:rPr>
-          <w:rtl w:val="0"/>
+          <w:lang w:val="en-US"/>
         </w:rPr>
         <w:t xml:space="preserve">Estrutura bem definida para a reunião, contemplando agenda, tempo, participantes e modelos (templates) prontos para facilitar a criação de encontros recorrentes.</w:t>
       </w:r>
       <w:r/>
     </w:p>
-    <w:p>
+    <w:p xmlns:wp14="http://schemas.microsoft.com/office/word/2010/wordml" wp14:textId="77777777">
       <w:pPr>
         <w:numPr>
           <w:ilvl w:val="1"/>
           <w:numId w:val="3"/>
         </w:numPr>
-        <w:pBdr/>
         <w:spacing w:after="0"/>
-        <w:ind w:hanging="360" w:left="1440"/>
+        <w:ind w:left="1440" w:hanging="360"/>
         <w:rPr/>
       </w:pPr>
       <w:r>
         <w:rPr>
-          <w:rtl w:val="0"/>
+          <w:lang w:val="en-US"/>
         </w:rPr>
         <w:t xml:space="preserve">Registro eficiente de itens de ação (</w:t>
       </w:r>
       <w:r>
         <w:rPr>
-          <w:i/>
-          <w:iCs/>
-          <w:rtl w:val="0"/>
+          <w:i w:val="1"/>
+          <w:iCs w:val="1"/>
+          <w:lang w:val="en-US"/>
         </w:rPr>
         <w:t xml:space="preserve">Action Items</w:t>
       </w:r>
       <w:r>
         <w:rPr>
-          <w:rtl w:val="0"/>
+          <w:lang w:val="en-US"/>
         </w:rPr>
         <w:t xml:space="preserve">), que documenta exatamente quem precisa fazer o quê, eliminando a comum confusão de "o que ficou decidido na reunião?".</w:t>
       </w:r>
       <w:r/>
     </w:p>
-    <w:p>
+    <w:p xmlns:wp14="http://schemas.microsoft.com/office/word/2010/wordml" wp14:textId="77777777">
       <w:pPr>
         <w:numPr>
           <w:ilvl w:val="1"/>
           <w:numId w:val="3"/>
         </w:numPr>
-        <w:pBdr/>
         <w:spacing w:after="0"/>
-        <w:ind w:hanging="360" w:left="1440"/>
+        <w:ind w:left="1440" w:hanging="360"/>
         <w:rPr/>
       </w:pPr>
       <w:r>
         <w:rPr>
-          <w:rtl w:val="0"/>
+          <w:lang w:val="en-US"/>
         </w:rPr>
         <w:t xml:space="preserve">Mantém um histórico de fácil consulta para resgatar informações de encontros anteriores.</w:t>
       </w:r>
       <w:r/>
     </w:p>
-    <w:p>
+    <w:p xmlns:wp14="http://schemas.microsoft.com/office/word/2010/wordml" wp14:textId="77777777">
       <w:pPr>
         <w:numPr>
           <w:ilvl w:val="0"/>
           <w:numId w:val="3"/>
         </w:numPr>
-        <w:pBdr/>
         <w:spacing w:after="0"/>
-        <w:ind w:hanging="360" w:left="720"/>
+        <w:ind w:left="720" w:hanging="360"/>
         <w:rPr/>
       </w:pPr>
       <w:r>
         <w:rPr>
-          <w:b/>
-          <w:bCs/>
-          <w:rtl w:val="0"/>
+          <w:b w:val="1"/>
+          <w:bCs w:val="1"/>
+          <w:lang w:val="en-US"/>
         </w:rPr>
         <w:t xml:space="preserve">Pontos Fracos:</w:t>
       </w:r>
@@ -351,79 +339,76 @@
       </w:r>
       <w:r/>
     </w:p>
-    <w:p>
+    <w:p xmlns:wp14="http://schemas.microsoft.com/office/word/2010/wordml" wp14:textId="77777777">
       <w:pPr>
         <w:numPr>
           <w:ilvl w:val="1"/>
           <w:numId w:val="3"/>
         </w:numPr>
-        <w:pBdr/>
         <w:spacing w:after="0"/>
-        <w:ind w:hanging="360" w:left="1440"/>
+        <w:ind w:left="1440" w:hanging="360"/>
         <w:rPr/>
       </w:pPr>
       <w:r>
         <w:rPr>
-          <w:rtl w:val="0"/>
+          <w:lang w:val="en-US"/>
         </w:rPr>
         <w:t xml:space="preserve">Apresenta uma interface menos moderna quando comparada a ferramentas de trabalho atuais como Notion ou Linear.</w:t>
       </w:r>
       <w:r/>
     </w:p>
-    <w:p>
+    <w:p xmlns:wp14="http://schemas.microsoft.com/office/word/2010/wordml" wp14:textId="77777777">
       <w:pPr>
         <w:numPr>
           <w:ilvl w:val="1"/>
           <w:numId w:val="3"/>
         </w:numPr>
-        <w:pBdr/>
         <w:spacing w:after="0"/>
-        <w:ind w:hanging="360" w:left="1440"/>
+        <w:ind w:left="1440" w:hanging="360"/>
         <w:rPr/>
       </w:pPr>
       <w:r>
         <w:rPr>
-          <w:rtl w:val="0"/>
+          <w:lang w:val="en-US"/>
         </w:rPr>
         <w:t xml:space="preserve">A experiência mobile é limitada e o fluxo pode ser muito complexo e burocrático para necessidades simples ou reuniões pequenas.</w:t>
       </w:r>
       <w:r/>
     </w:p>
-    <w:p>
+    <w:p xmlns:wp14="http://schemas.microsoft.com/office/word/2010/wordml" wp14:textId="77777777">
       <w:pPr>
         <w:numPr>
           <w:ilvl w:val="1"/>
           <w:numId w:val="3"/>
         </w:numPr>
-        <w:pBdr/>
         <w:spacing w:after="240"/>
-        <w:ind w:hanging="360" w:left="1440"/>
+        <w:ind w:left="1440" w:hanging="360"/>
         <w:rPr/>
       </w:pPr>
       <w:r>
         <w:rPr>
-          <w:rtl w:val="0"/>
+          <w:lang w:val="en-US"/>
         </w:rPr>
         <w:t xml:space="preserve">O custo pode ser impeditivo para equipes menores e a plataforma exige uma curva de aprendizado alta, além de não ter foco na videoconferência em si.</w:t>
       </w:r>
       <w:r/>
     </w:p>
-    <w:p>
-      <w:pPr>
-        <w:pBdr/>
+    <w:p xmlns:wp14="http://schemas.microsoft.com/office/word/2010/wordml" wp14:textId="77777777">
+      <w:pPr>
         <w:spacing w:after="240"/>
         <w:ind/>
         <w:jc w:val="both"/>
         <w:rPr>
-          <w:b/>
-          <w:bCs/>
+          <w:b w:val="1"/>
+          <w:bCs w:val="1"/>
+          <w:lang w:val="en-US"/>
         </w:rPr>
       </w:pPr>
       <w:r>
         <w:rPr>
-          <w:b/>
-          <w:bCs/>
-          <w:rtl w:val="0"/>
+          <w:b w:val="1"/>
+          <w:bCs w:val="1"/>
+          <w:lang w:val="en-US"/>
         </w:rPr>
         <w:t xml:space="preserve">2. Beenote</w:t>
       </w:r>
@@ -434,81 +419,79 @@
         </w:rPr>
       </w:r>
     </w:p>
-    <w:p>
+    <w:p xmlns:wp14="http://schemas.microsoft.com/office/word/2010/wordml" wp14:textId="77777777">
       <w:pPr>
         <w:numPr>
           <w:ilvl w:val="0"/>
           <w:numId w:val="2"/>
         </w:numPr>
-        <w:pBdr/>
         <w:spacing w:after="0"/>
-        <w:ind w:hanging="360" w:left="720"/>
+        <w:ind w:left="720" w:hanging="360"/>
         <w:rPr/>
       </w:pPr>
       <w:r>
         <w:rPr>
-          <w:b/>
-          <w:bCs/>
-          <w:rtl w:val="0"/>
+          <w:b w:val="1"/>
+          <w:bCs w:val="1"/>
+          <w:lang w:val="en-US"/>
         </w:rPr>
         <w:t xml:space="preserve">Breve Descrição:</w:t>
       </w:r>
       <w:r>
         <w:rPr>
-          <w:rtl w:val="0"/>
+          <w:lang w:val="en-US"/>
         </w:rPr>
         <w:t xml:space="preserve"> Software de governança de reuniões focado estritamente na documentação e produtividade do ciclo completo do encontro (antes, durante e depois).</w:t>
       </w:r>
       <w:r/>
     </w:p>
-    <w:p>
+    <w:p xmlns:wp14="http://schemas.microsoft.com/office/word/2010/wordml" wp14:textId="77777777">
       <w:pPr>
         <w:numPr>
           <w:ilvl w:val="0"/>
           <w:numId w:val="2"/>
         </w:numPr>
-        <w:pBdr/>
         <w:spacing w:after="0"/>
-        <w:ind w:hanging="360" w:left="720"/>
+        <w:ind w:left="720" w:hanging="360"/>
         <w:rPr/>
       </w:pPr>
       <w:r>
         <w:rPr>
-          <w:b/>
-          <w:bCs/>
-          <w:rtl w:val="0"/>
+          <w:b w:val="1"/>
+          <w:bCs w:val="1"/>
+          <w:lang w:val="en-US"/>
         </w:rPr>
         <w:t xml:space="preserve">Diferencial de Destaque:</w:t>
       </w:r>
       <w:r>
         <w:rPr>
-          <w:rtl w:val="0"/>
+          <w:lang w:val="en-US"/>
         </w:rPr>
         <w:t xml:space="preserve"> </w:t>
       </w:r>
       <w:r>
         <w:rPr>
-          <w:i/>
-          <w:iCs/>
-          <w:rtl w:val="0"/>
+          <w:i w:val="1"/>
+          <w:iCs w:val="1"/>
+          <w:lang w:val="en-US"/>
         </w:rPr>
         <w:t xml:space="preserve">Gestão Visual de Tempo (Timeboxing).</w:t>
       </w:r>
       <w:r>
         <w:rPr>
-          <w:rtl w:val="0"/>
+          <w:lang w:val="en-US"/>
         </w:rPr>
         <w:t xml:space="preserve"> Durante a execução da reunião, a interface do sistema se transforma e exibe um cronômetro rigoros</w:t>
       </w:r>
       <w:r>
         <w:rPr>
-          <w:rtl w:val="0"/>
+          <w:lang w:val="en-US"/>
         </w:rPr>
         <w:t xml:space="preserve">o atrelado a cada tópico da pauta. Se um assunto foi planejado para durar um tempo específico, o sistema força o foco dos participantes de forma visual, evitando dispersões e garantindo que o cronograma estipulado previamente não seja estourado na prática.</w:t>
       </w:r>
       <w:r/>
     </w:p>
-    <w:p>
+    <w:p xmlns:wp14="http://schemas.microsoft.com/office/word/2010/wordml" wp14:textId="77777777">
       <w:pPr>
         <w:numPr>
           <w:ilvl w:val="0"/>
@@ -516,7 +499,7 @@
         </w:numPr>
         <w:pBdr/>
         <w:spacing w:after="0"/>
-        <w:ind w:hanging="360" w:left="720"/>
+        <w:ind w:left="720" w:hanging="360"/>
         <w:rPr/>
       </w:pPr>
       <w:r>
@@ -534,93 +517,89 @@
       </w:r>
       <w:r/>
     </w:p>
-    <w:p>
+    <w:p xmlns:wp14="http://schemas.microsoft.com/office/word/2010/wordml" wp14:textId="77777777">
       <w:pPr>
         <w:numPr>
           <w:ilvl w:val="1"/>
           <w:numId w:val="2"/>
         </w:numPr>
-        <w:pBdr/>
         <w:spacing w:after="0"/>
-        <w:ind w:hanging="360" w:left="1440"/>
+        <w:ind w:left="1440" w:hanging="360"/>
         <w:rPr/>
       </w:pPr>
       <w:r>
         <w:rPr>
-          <w:rtl w:val="0"/>
+          <w:lang w:val="en-US"/>
         </w:rPr>
         <w:t xml:space="preserve">Possui um construtor de pautas colaborativo que permite definir tópicos, designar líderes e alocar um tempo específico para cada assunto, forçando a organização prévia.</w:t>
       </w:r>
       <w:r/>
     </w:p>
-    <w:p>
+    <w:p xmlns:wp14="http://schemas.microsoft.com/office/word/2010/wordml" wp14:textId="77777777">
       <w:pPr>
         <w:numPr>
           <w:ilvl w:val="1"/>
           <w:numId w:val="2"/>
         </w:numPr>
-        <w:pBdr/>
         <w:spacing w:after="0"/>
-        <w:ind w:hanging="360" w:left="1440"/>
+        <w:ind w:left="1440" w:hanging="360"/>
         <w:rPr/>
       </w:pPr>
       <w:r>
         <w:rPr>
-          <w:rtl w:val="0"/>
+          <w:lang w:val="en-US"/>
         </w:rPr>
         <w:t xml:space="preserve">Durante a chamada, a interface exibe a pauta ao lado de um editor de texto em tempo real.</w:t>
       </w:r>
       <w:r/>
     </w:p>
-    <w:p>
+    <w:p xmlns:wp14="http://schemas.microsoft.com/office/word/2010/wordml" wp14:textId="77777777">
       <w:pPr>
         <w:numPr>
           <w:ilvl w:val="1"/>
           <w:numId w:val="2"/>
         </w:numPr>
-        <w:pBdr/>
         <w:spacing w:after="0"/>
-        <w:ind w:hanging="360" w:left="1440"/>
+        <w:ind w:left="1440" w:hanging="360"/>
         <w:rPr/>
       </w:pPr>
       <w:r>
         <w:rPr>
-          <w:rtl w:val="0"/>
+          <w:lang w:val="en-US"/>
         </w:rPr>
         <w:t xml:space="preserve">Ao final do encontro, o sistema compila e distribui as atas automaticamente em arquivos PDF (</w:t>
       </w:r>
       <w:r>
         <w:rPr>
-          <w:i/>
-          <w:iCs/>
-          <w:rtl w:val="0"/>
+          <w:i w:val="1"/>
+          <w:iCs w:val="1"/>
+          <w:lang w:val="en-US"/>
         </w:rPr>
         <w:t xml:space="preserve">Portable Document Format</w:t>
       </w:r>
       <w:r>
         <w:rPr>
-          <w:rtl w:val="0"/>
+          <w:lang w:val="en-US"/>
         </w:rPr>
         <w:t xml:space="preserve">, formato padrão de documentos), centralizando as cobranças em um painel de tarefas integrado com envio de lembretes.</w:t>
       </w:r>
       <w:r/>
     </w:p>
-    <w:p>
+    <w:p xmlns:wp14="http://schemas.microsoft.com/office/word/2010/wordml" wp14:textId="77777777">
       <w:pPr>
         <w:numPr>
           <w:ilvl w:val="0"/>
           <w:numId w:val="2"/>
         </w:numPr>
-        <w:pBdr/>
         <w:spacing w:after="0"/>
-        <w:ind w:hanging="360" w:left="720"/>
+        <w:ind w:left="720" w:hanging="360"/>
         <w:rPr/>
       </w:pPr>
       <w:r>
         <w:rPr>
-          <w:b/>
-          <w:bCs/>
-          <w:rtl w:val="0"/>
+          <w:b w:val="1"/>
+          <w:bCs w:val="1"/>
+          <w:lang w:val="en-US"/>
         </w:rPr>
         <w:t xml:space="preserve">Pontos Fracos:</w:t>
       </w:r>
@@ -631,103 +610,100 @@
       </w:r>
       <w:r/>
     </w:p>
-    <w:p>
+    <w:p xmlns:wp14="http://schemas.microsoft.com/office/word/2010/wordml" wp14:textId="77777777">
       <w:pPr>
         <w:numPr>
           <w:ilvl w:val="1"/>
           <w:numId w:val="2"/>
         </w:numPr>
-        <w:pBdr/>
         <w:spacing w:after="0"/>
-        <w:ind w:hanging="360" w:left="1440"/>
+        <w:ind w:left="1440" w:hanging="360"/>
         <w:rPr/>
       </w:pPr>
       <w:r>
         <w:rPr>
-          <w:rtl w:val="0"/>
+          <w:lang w:val="en-US"/>
         </w:rPr>
         <w:t xml:space="preserve">Por ser desenhado para governança tradicional e conselhos, o sistema torna-se engessado e burocrático para equipes ágeis.</w:t>
       </w:r>
       <w:r/>
     </w:p>
-    <w:p>
+    <w:p xmlns:wp14="http://schemas.microsoft.com/office/word/2010/wordml" wp14:textId="77777777">
       <w:pPr>
         <w:numPr>
           <w:ilvl w:val="1"/>
           <w:numId w:val="2"/>
         </w:numPr>
-        <w:pBdr/>
         <w:spacing w:after="0"/>
-        <w:ind w:hanging="360" w:left="1440"/>
+        <w:ind w:left="1440" w:hanging="360"/>
         <w:rPr/>
       </w:pPr>
       <w:r>
         <w:rPr>
-          <w:rtl w:val="0"/>
+          <w:lang w:val="en-US"/>
         </w:rPr>
         <w:t xml:space="preserve">Possui um design pouco intuitivo e uma interface pesada, prejudicando a UX (</w:t>
       </w:r>
       <w:r>
         <w:rPr>
-          <w:i/>
-          <w:iCs/>
-          <w:rtl w:val="0"/>
+          <w:i w:val="1"/>
+          <w:iCs w:val="1"/>
+          <w:lang w:val="en-US"/>
         </w:rPr>
         <w:t xml:space="preserve">User Experience</w:t>
       </w:r>
       <w:r>
         <w:rPr>
-          <w:rtl w:val="0"/>
+          <w:lang w:val="en-US"/>
         </w:rPr>
         <w:t xml:space="preserve">, ou Experiência do Usuário).</w:t>
       </w:r>
       <w:r/>
     </w:p>
-    <w:p>
+    <w:p xmlns:wp14="http://schemas.microsoft.com/office/word/2010/wordml" wp14:textId="77777777">
       <w:pPr>
         <w:numPr>
           <w:ilvl w:val="1"/>
           <w:numId w:val="2"/>
         </w:numPr>
-        <w:pBdr/>
         <w:spacing w:after="240"/>
-        <w:ind w:hanging="360" w:left="1440"/>
+        <w:ind w:left="1440" w:hanging="360"/>
         <w:rPr/>
       </w:pPr>
       <w:r>
         <w:rPr>
-          <w:rtl w:val="0"/>
+          <w:lang w:val="en-US"/>
         </w:rPr>
         <w:t xml:space="preserve">Embora rastreie tarefas, as métricas de produtividade são básicas e carecem de relatórios visuais profundos sobre o ROI (</w:t>
       </w:r>
       <w:r>
         <w:rPr>
-          <w:i/>
-          <w:iCs/>
-          <w:rtl w:val="0"/>
+          <w:i w:val="1"/>
+          <w:iCs w:val="1"/>
+          <w:lang w:val="en-US"/>
         </w:rPr>
         <w:t xml:space="preserve">Return on Investment</w:t>
       </w:r>
       <w:r>
         <w:rPr>
-          <w:rtl w:val="0"/>
+          <w:lang w:val="en-US"/>
         </w:rPr>
         <w:t xml:space="preserve">, ou Retorno sobre o Investimento) do tempo gasto nas reuniões.</w:t>
       </w:r>
       <w:r/>
     </w:p>
-    <w:p>
+    <w:p xmlns:wp14="http://schemas.microsoft.com/office/word/2010/wordml" wp14:textId="77777777">
       <w:pPr>
         <w:pBdr/>
         <w:spacing w:after="240"/>
-        <w:ind w:firstLine="0" w:left="0"/>
+        <w:ind w:left="0" w:firstLine="0"/>
         <w:rPr/>
       </w:pPr>
       <w:r>
         <mc:AlternateContent>
           <mc:Choice Requires="wpg">
             <w:drawing>
-              <wp:inline xmlns:wp="http://schemas.openxmlformats.org/drawingml/2006/wordprocessingDrawing" distT="0" distB="0" distL="0" distR="0">
+              <wp:inline xmlns:wp="http://schemas.openxmlformats.org/drawingml/2006/wordprocessingDrawing" xmlns:wp14="http://schemas.microsoft.com/office/word/2010/wordprocessingDrawing" distT="0" distB="0" distL="0" distR="0" wp14:anchorId="061625E4" wp14:editId="7777777">
                 <wp:extent cx="5943600" cy="3111500"/>
                 <wp:effectExtent l="0" t="0" r="0" b="0"/>
                 <wp:docPr id="1" name="image3.png"/>
@@ -762,8 +738,8 @@
             </w:drawing>
           </mc:Choice>
           <mc:Fallback>
-            <w:pict>
-              <v:shapetype id="_x0000_t75" coordsize="21600,21600" o:spt="75" o:preferrelative="t" path="m@4@5l@4@11@9@11@9@5xe" filled="f" stroked="f">
+            <w:pict w14:anchorId="7A3690BE">
+              <v:shapetype id="_x0000_t75" coordsize="21600,21600" filled="f" stroked="f" o:spt="75" o:preferrelative="t" path="m@4@5l@4@11@9@11@9@5xe">
                 <v:stroke joinstyle="miter"/>
                 <v:formulas>
                   <v:f eqn="if lineDrawn pixelLineWidth 0"/>
@@ -779,11 +755,11 @@
                   <v:f eqn="prod @7 21600 pixelHeight"/>
                   <v:f eqn="sum @10 21600 0"/>
                 </v:formulas>
-                <v:path o:extrusionok="f" gradientshapeok="t" o:connecttype="rect"/>
+                <v:path gradientshapeok="t" o:connecttype="rect" o:extrusionok="f"/>
                 <o:lock v:ext="edit" aspectratio="t"/>
               </v:shapetype>
-              <v:shape id="_x0000_i0" o:spid="_x0000_s0" type="#_x0000_t75" style="width:468.00pt;height:245.00pt;mso-wrap-distance-left:0.00pt;mso-wrap-distance-top:0.00pt;mso-wrap-distance-right:0.00pt;mso-wrap-distance-bottom:0.00pt;z-index:1;">
-                <v:imagedata r:id="rId9" o:title="" croptop="0f" cropleft="0f" cropbottom="0f" cropright="0f"/>
+              <v:shape id="_x0000_i0" style="width:468.00pt;height:245.00pt;mso-wrap-distance-left:0.00pt;mso-wrap-distance-top:0.00pt;mso-wrap-distance-right:0.00pt;mso-wrap-distance-bottom:0.00pt;z-index:1;" o:spid="_x0000_s0" type="#_x0000_t75">
+                <v:imagedata cropleft="0f" croptop="0f" cropright="0f" cropbottom="0f" o:title="" r:id="rId9"/>
                 <o:lock v:ext="edit" rotation="t"/>
               </v:shape>
             </w:pict>
@@ -797,18 +773,18 @@
       </w:r>
       <w:r/>
     </w:p>
-    <w:p>
+    <w:p xmlns:wp14="http://schemas.microsoft.com/office/word/2010/wordml" wp14:textId="77777777">
       <w:pPr>
         <w:pBdr/>
         <w:spacing w:after="240"/>
-        <w:ind w:firstLine="0" w:left="0"/>
+        <w:ind w:left="0" w:firstLine="0"/>
         <w:rPr/>
       </w:pPr>
       <w:r>
         <mc:AlternateContent>
           <mc:Choice Requires="wpg">
             <w:drawing>
-              <wp:inline xmlns:wp="http://schemas.openxmlformats.org/drawingml/2006/wordprocessingDrawing" distT="0" distB="0" distL="0" distR="0">
+              <wp:inline xmlns:wp="http://schemas.openxmlformats.org/drawingml/2006/wordprocessingDrawing" xmlns:wp14="http://schemas.microsoft.com/office/word/2010/wordprocessingDrawing" distT="0" distB="0" distL="0" distR="0" wp14:anchorId="736D66F5" wp14:editId="7777777">
                 <wp:extent cx="5943600" cy="3086100"/>
                 <wp:effectExtent l="0" t="0" r="0" b="0"/>
                 <wp:docPr id="2" name="image4.png"/>
@@ -843,8 +819,8 @@
             </w:drawing>
           </mc:Choice>
           <mc:Fallback>
-            <w:pict>
-              <v:shapetype id="_x0000_t75" coordsize="21600,21600" o:spt="75" o:preferrelative="t" path="m@4@5l@4@11@9@11@9@5xe" filled="f" stroked="f">
+            <w:pict w14:anchorId="16642BBB">
+              <v:shapetype id="_x0000_t75" coordsize="21600,21600" filled="f" stroked="f" o:spt="75" o:preferrelative="t" path="m@4@5l@4@11@9@11@9@5xe">
                 <v:stroke joinstyle="miter"/>
                 <v:formulas>
                   <v:f eqn="if lineDrawn pixelLineWidth 0"/>
@@ -860,11 +836,11 @@
                   <v:f eqn="prod @7 21600 pixelHeight"/>
                   <v:f eqn="sum @10 21600 0"/>
                 </v:formulas>
-                <v:path o:extrusionok="f" gradientshapeok="t" o:connecttype="rect"/>
+                <v:path gradientshapeok="t" o:connecttype="rect" o:extrusionok="f"/>
                 <o:lock v:ext="edit" aspectratio="t"/>
               </v:shapetype>
-              <v:shape id="_x0000_i1" o:spid="_x0000_s1" type="#_x0000_t75" style="width:468.00pt;height:243.00pt;mso-wrap-distance-left:0.00pt;mso-wrap-distance-top:0.00pt;mso-wrap-distance-right:0.00pt;mso-wrap-distance-bottom:0.00pt;z-index:1;">
-                <v:imagedata r:id="rId10" o:title="" croptop="0f" cropleft="0f" cropbottom="0f" cropright="0f"/>
+              <v:shape id="_x0000_i1" style="width:468.00pt;height:243.00pt;mso-wrap-distance-left:0.00pt;mso-wrap-distance-top:0.00pt;mso-wrap-distance-right:0.00pt;mso-wrap-distance-bottom:0.00pt;z-index:1;" o:spid="_x0000_s1" type="#_x0000_t75">
+                <v:imagedata cropleft="0f" croptop="0f" cropright="0f" cropbottom="0f" o:title="" r:id="rId10"/>
                 <o:lock v:ext="edit" rotation="t"/>
               </v:shape>
             </w:pict>
@@ -878,7 +854,7 @@
       </w:r>
       <w:r/>
     </w:p>
-    <w:p>
+    <w:p xmlns:wp14="http://schemas.microsoft.com/office/word/2010/wordml" wp14:textId="77777777">
       <w:pPr>
         <w:pBdr/>
         <w:spacing w:after="240"/>
@@ -904,103 +880,101 @@
         </w:rPr>
       </w:r>
     </w:p>
-    <w:p>
+    <w:p xmlns:wp14="http://schemas.microsoft.com/office/word/2010/wordml" wp14:textId="77777777">
       <w:pPr>
         <w:numPr>
           <w:ilvl w:val="0"/>
           <w:numId w:val="5"/>
         </w:numPr>
-        <w:pBdr/>
         <w:spacing w:after="0"/>
-        <w:ind w:hanging="360" w:left="720"/>
+        <w:ind w:left="720" w:hanging="360"/>
         <w:rPr/>
       </w:pPr>
       <w:r>
         <w:rPr>
-          <w:b/>
-          <w:bCs/>
-          <w:rtl w:val="0"/>
+          <w:b w:val="1"/>
+          <w:bCs w:val="1"/>
+          <w:lang w:val="en-US"/>
         </w:rPr>
         <w:t xml:space="preserve">Breve Descrição:</w:t>
       </w:r>
       <w:r>
         <w:rPr>
-          <w:rtl w:val="0"/>
+          <w:lang w:val="en-US"/>
         </w:rPr>
         <w:t xml:space="preserve"> Plataforma de gestão do ciclo de vida da reunião (</w:t>
       </w:r>
       <w:r>
         <w:rPr>
-          <w:i/>
-          <w:iCs/>
-          <w:rtl w:val="0"/>
+          <w:i w:val="1"/>
+          <w:iCs w:val="1"/>
+          <w:lang w:val="en-US"/>
         </w:rPr>
         <w:t xml:space="preserve">Meeting Lifecycle Management</w:t>
       </w:r>
       <w:r>
         <w:rPr>
-          <w:rtl w:val="0"/>
+          <w:lang w:val="en-US"/>
         </w:rPr>
         <w:t xml:space="preserve">) que conecta pautas e anotações a projetos maiores e prestação de contas.</w:t>
       </w:r>
       <w:r/>
     </w:p>
-    <w:p>
+    <w:p xmlns:wp14="http://schemas.microsoft.com/office/word/2010/wordml" wp14:textId="77777777">
       <w:pPr>
         <w:numPr>
           <w:ilvl w:val="0"/>
           <w:numId w:val="5"/>
         </w:numPr>
-        <w:pBdr/>
         <w:spacing w:after="0"/>
-        <w:ind w:hanging="360" w:left="720"/>
+        <w:ind w:left="720" w:hanging="360"/>
         <w:rPr/>
       </w:pPr>
       <w:r>
         <w:rPr>
-          <w:b/>
-          <w:bCs/>
-          <w:rtl w:val="0"/>
+          <w:b w:val="1"/>
+          <w:bCs w:val="1"/>
+          <w:lang w:val="en-US"/>
         </w:rPr>
         <w:t xml:space="preserve">Diferencial de Destaque:</w:t>
       </w:r>
       <w:r>
         <w:rPr>
-          <w:rtl w:val="0"/>
+          <w:lang w:val="en-US"/>
         </w:rPr>
         <w:t xml:space="preserve"> </w:t>
       </w:r>
       <w:r>
         <w:rPr>
-          <w:i/>
-          <w:iCs/>
-          <w:rtl w:val="0"/>
+          <w:i w:val="1"/>
+          <w:iCs w:val="1"/>
+          <w:lang w:val="en-US"/>
         </w:rPr>
         <w:t xml:space="preserve">Ferramentas Nativas para Tomada de Decisão.</w:t>
       </w:r>
       <w:r>
         <w:rPr>
-          <w:rtl w:val="0"/>
+          <w:lang w:val="en-US"/>
         </w:rPr>
         <w:t xml:space="preserve"> Diferente dos concorrentes que se limitam a áreas de anotação de texto, o adam.ai incorpora recursos interativos como enquetes e votações rápidas (</w:t>
       </w:r>
       <w:r>
         <w:rPr>
-          <w:i/>
-          <w:iCs/>
-          <w:rtl w:val="0"/>
+          <w:i w:val="1"/>
+          <w:iCs w:val="1"/>
+          <w:lang w:val="en-US"/>
         </w:rPr>
         <w:t xml:space="preserve">polls</w:t>
       </w:r>
       <w:r>
         <w:rPr>
-          <w:rtl w:val="0"/>
+          <w:lang w:val="en-US"/>
         </w:rPr>
         <w:t xml:space="preserve">) dentro do próprio painel da reunião. Isso ajuda a coletar a opinião do grupo de forma transparente, resolvendo longas discussões através de decisões objetivas, informadas e devidamente registradas em contexto.</w:t>
       </w:r>
       <w:r/>
     </w:p>
-    <w:p>
+    <w:p xmlns:wp14="http://schemas.microsoft.com/office/word/2010/wordml" wp14:textId="77777777">
       <w:pPr>
         <w:numPr>
           <w:ilvl w:val="0"/>
@@ -1008,7 +982,7 @@
         </w:numPr>
         <w:pBdr/>
         <w:spacing w:after="0"/>
-        <w:ind w:hanging="360" w:left="720"/>
+        <w:ind w:left="720" w:hanging="360"/>
         <w:rPr/>
       </w:pPr>
       <w:r>
@@ -1026,93 +1000,89 @@
       </w:r>
       <w:r/>
     </w:p>
-    <w:p>
+    <w:p xmlns:wp14="http://schemas.microsoft.com/office/word/2010/wordml" wp14:textId="77777777">
       <w:pPr>
         <w:numPr>
           <w:ilvl w:val="1"/>
           <w:numId w:val="5"/>
         </w:numPr>
-        <w:pBdr/>
         <w:spacing w:after="0"/>
-        <w:ind w:hanging="360" w:left="1440"/>
+        <w:ind w:left="1440" w:hanging="360"/>
         <w:rPr/>
       </w:pPr>
       <w:r>
         <w:rPr>
-          <w:rtl w:val="0"/>
+          <w:lang w:val="en-US"/>
         </w:rPr>
         <w:t xml:space="preserve">Apresenta painéis dinâmicos de anotações colaborativas que separam visualmente, em tempo real, o que são "Decisões" e o que são "Itens de Ação".</w:t>
       </w:r>
       <w:r/>
     </w:p>
-    <w:p>
+    <w:p xmlns:wp14="http://schemas.microsoft.com/office/word/2010/wordml" wp14:textId="77777777">
       <w:pPr>
         <w:numPr>
           <w:ilvl w:val="1"/>
           <w:numId w:val="5"/>
         </w:numPr>
-        <w:pBdr/>
         <w:spacing w:after="0"/>
-        <w:ind w:hanging="360" w:left="1440"/>
+        <w:ind w:left="1440" w:hanging="360"/>
         <w:rPr/>
       </w:pPr>
       <w:r>
         <w:rPr>
-          <w:rtl w:val="0"/>
+          <w:lang w:val="en-US"/>
         </w:rPr>
         <w:t xml:space="preserve">Tradução automática de tópicos em tarefas com responsáveis claros, garantindo a responsabilização (</w:t>
       </w:r>
       <w:r>
         <w:rPr>
-          <w:i/>
-          <w:iCs/>
-          <w:rtl w:val="0"/>
+          <w:i w:val="1"/>
+          <w:iCs w:val="1"/>
+          <w:lang w:val="en-US"/>
         </w:rPr>
         <w:t xml:space="preserve">accountability</w:t>
       </w:r>
       <w:r>
         <w:rPr>
-          <w:rtl w:val="0"/>
+          <w:lang w:val="en-US"/>
         </w:rPr>
         <w:t xml:space="preserve">) da equipe.</w:t>
       </w:r>
       <w:r/>
     </w:p>
-    <w:p>
+    <w:p xmlns:wp14="http://schemas.microsoft.com/office/word/2010/wordml" wp14:textId="77777777">
       <w:pPr>
         <w:numPr>
           <w:ilvl w:val="1"/>
           <w:numId w:val="5"/>
         </w:numPr>
-        <w:pBdr/>
         <w:spacing w:after="0"/>
-        <w:ind w:hanging="360" w:left="1440"/>
+        <w:ind w:left="1440" w:hanging="360"/>
         <w:rPr/>
       </w:pPr>
       <w:r>
         <w:rPr>
-          <w:rtl w:val="0"/>
+          <w:lang w:val="en-US"/>
         </w:rPr>
         <w:t xml:space="preserve">Garante alto nível de segurança corporativa, possuindo certificações internacionais de proteção de dados (como SOC 2 e ISO 27001), e permite que as ações rastreadas sejam vinculadas a outros aplicativos.</w:t>
       </w:r>
       <w:r/>
     </w:p>
-    <w:p>
+    <w:p xmlns:wp14="http://schemas.microsoft.com/office/word/2010/wordml" wp14:textId="77777777">
       <w:pPr>
         <w:numPr>
           <w:ilvl w:val="0"/>
           <w:numId w:val="5"/>
         </w:numPr>
-        <w:pBdr/>
         <w:spacing w:after="0"/>
-        <w:ind w:hanging="360" w:left="720"/>
+        <w:ind w:left="720" w:hanging="360"/>
         <w:rPr/>
       </w:pPr>
       <w:r>
         <w:rPr>
-          <w:b/>
-          <w:bCs/>
-          <w:rtl w:val="0"/>
+          <w:b w:val="1"/>
+          <w:bCs w:val="1"/>
+          <w:lang w:val="en-US"/>
         </w:rPr>
         <w:t xml:space="preserve">Pontos Fracos:</w:t>
       </w:r>
@@ -1123,93 +1093,90 @@
       </w:r>
       <w:r/>
     </w:p>
-    <w:p>
+    <w:p xmlns:wp14="http://schemas.microsoft.com/office/word/2010/wordml" wp14:textId="77777777">
       <w:pPr>
         <w:numPr>
           <w:ilvl w:val="1"/>
           <w:numId w:val="5"/>
         </w:numPr>
-        <w:pBdr/>
         <w:spacing w:after="0"/>
-        <w:ind w:hanging="360" w:left="1440"/>
+        <w:ind w:left="1440" w:hanging="360"/>
         <w:rPr/>
       </w:pPr>
       <w:r>
         <w:rPr>
-          <w:rtl w:val="0"/>
+          <w:lang w:val="en-US"/>
         </w:rPr>
         <w:t xml:space="preserve">O foco excessivo na alta diretoria executiva resulta em uma interface poluída por painéis de inteligência artificial e métricas de conformidade, gerando uma curva de aprendizado íngreme.</w:t>
       </w:r>
       <w:r/>
     </w:p>
-    <w:p>
+    <w:p xmlns:wp14="http://schemas.microsoft.com/office/word/2010/wordml" wp14:textId="77777777">
       <w:pPr>
         <w:numPr>
           <w:ilvl w:val="1"/>
           <w:numId w:val="5"/>
         </w:numPr>
-        <w:pBdr/>
         <w:spacing w:after="0"/>
-        <w:ind w:hanging="360" w:left="1440"/>
+        <w:ind w:left="1440" w:hanging="360"/>
         <w:rPr/>
       </w:pPr>
       <w:r>
         <w:rPr>
-          <w:rtl w:val="0"/>
+          <w:lang w:val="en-US"/>
         </w:rPr>
         <w:t xml:space="preserve">A usabilidade em dispositivos móveis é severamente prejudicada pela insistência em manter um layout tradicional de desktop com tela dividida (</w:t>
       </w:r>
       <w:r>
         <w:rPr>
-          <w:i/>
-          <w:iCs/>
-          <w:rtl w:val="0"/>
+          <w:i w:val="1"/>
+          <w:iCs w:val="1"/>
+          <w:lang w:val="en-US"/>
         </w:rPr>
         <w:t xml:space="preserve">split-screen</w:t>
       </w:r>
       <w:r>
         <w:rPr>
-          <w:rtl w:val="0"/>
+          <w:lang w:val="en-US"/>
         </w:rPr>
         <w:t xml:space="preserve">).</w:t>
       </w:r>
       <w:r/>
     </w:p>
-    <w:p>
+    <w:p xmlns:wp14="http://schemas.microsoft.com/office/word/2010/wordml" wp14:textId="77777777">
       <w:pPr>
         <w:numPr>
           <w:ilvl w:val="1"/>
           <w:numId w:val="5"/>
         </w:numPr>
-        <w:pBdr/>
         <w:spacing w:after="240"/>
-        <w:ind w:hanging="360" w:left="1440"/>
+        <w:ind w:left="1440" w:hanging="360"/>
         <w:rPr/>
       </w:pPr>
       <w:r>
         <w:rPr>
-          <w:rtl w:val="0"/>
+          <w:lang w:val="en-US"/>
         </w:rPr>
         <w:t xml:space="preserve">Apresenta alta fricção de acesso, com barreiras burocráticas para convidados e exigência de preenchimento de formulários de contato comercial apenas para testar a plataforma.</w:t>
       </w:r>
       <w:r/>
     </w:p>
-    <w:p>
-      <w:pPr>
-        <w:pBdr/>
+    <w:p xmlns:wp14="http://schemas.microsoft.com/office/word/2010/wordml" wp14:textId="77777777">
+      <w:pPr>
         <w:spacing w:after="240"/>
         <w:ind/>
         <w:jc w:val="both"/>
         <w:rPr>
-          <w:b/>
-          <w:bCs/>
+          <w:b w:val="1"/>
+          <w:bCs w:val="1"/>
+          <w:lang w:val="en-US"/>
         </w:rPr>
       </w:pPr>
       <w:r>
         <w:rPr>
-          <w:b/>
-          <w:bCs/>
-          <w:rtl w:val="0"/>
+          <w:b w:val="1"/>
+          <w:bCs w:val="1"/>
+          <w:lang w:val="en-US"/>
         </w:rPr>
         <w:t xml:space="preserve">4. Fellow (Fellow.app)</w:t>
       </w:r>
@@ -1220,109 +1187,107 @@
         </w:rPr>
       </w:r>
     </w:p>
-    <w:p>
+    <w:p xmlns:wp14="http://schemas.microsoft.com/office/word/2010/wordml" wp14:textId="77777777">
       <w:pPr>
         <w:numPr>
           <w:ilvl w:val="0"/>
           <w:numId w:val="4"/>
         </w:numPr>
-        <w:pBdr/>
         <w:spacing w:after="0"/>
-        <w:ind w:hanging="360" w:left="720"/>
+        <w:ind w:left="720" w:hanging="360"/>
         <w:rPr/>
       </w:pPr>
       <w:r>
         <w:rPr>
-          <w:b/>
-          <w:bCs/>
-          <w:rtl w:val="0"/>
+          <w:b w:val="1"/>
+          <w:bCs w:val="1"/>
+          <w:lang w:val="en-US"/>
         </w:rPr>
         <w:t xml:space="preserve">Breve Descrição:</w:t>
       </w:r>
       <w:r>
         <w:rPr>
-          <w:rtl w:val="0"/>
+          <w:lang w:val="en-US"/>
         </w:rPr>
         <w:t xml:space="preserve"> </w:t>
       </w:r>
       <w:r>
         <w:rPr>
-          <w:i/>
-          <w:iCs/>
-          <w:rtl w:val="0"/>
+          <w:i w:val="1"/>
+          <w:iCs w:val="1"/>
+          <w:lang w:val="en-US"/>
         </w:rPr>
         <w:t xml:space="preserve">Hub</w:t>
       </w:r>
       <w:r>
         <w:rPr>
-          <w:rtl w:val="0"/>
+          <w:lang w:val="en-US"/>
         </w:rPr>
         <w:t xml:space="preserve"> (ponto central) corporativo para a criação colaborativa de pautas, anotações e acompanhamento contínuo de tarefas (</w:t>
       </w:r>
       <w:r>
         <w:rPr>
-          <w:i/>
-          <w:iCs/>
-          <w:rtl w:val="0"/>
+          <w:i w:val="1"/>
+          <w:iCs w:val="1"/>
+          <w:lang w:val="en-US"/>
         </w:rPr>
         <w:t xml:space="preserve">action items</w:t>
       </w:r>
       <w:r>
         <w:rPr>
-          <w:rtl w:val="0"/>
+          <w:lang w:val="en-US"/>
         </w:rPr>
         <w:t xml:space="preserve">).</w:t>
       </w:r>
       <w:r/>
     </w:p>
-    <w:p>
+    <w:p xmlns:wp14="http://schemas.microsoft.com/office/word/2010/wordml" wp14:textId="77777777">
       <w:pPr>
         <w:numPr>
           <w:ilvl w:val="0"/>
           <w:numId w:val="4"/>
         </w:numPr>
-        <w:pBdr/>
         <w:spacing w:after="0"/>
-        <w:ind w:hanging="360" w:left="720"/>
+        <w:ind w:left="720" w:hanging="360"/>
         <w:rPr/>
       </w:pPr>
       <w:r>
         <w:rPr>
-          <w:b/>
-          <w:bCs/>
-          <w:rtl w:val="0"/>
+          <w:b w:val="1"/>
+          <w:bCs w:val="1"/>
+          <w:lang w:val="en-US"/>
         </w:rPr>
         <w:t xml:space="preserve">Diferencial de Destaque:</w:t>
       </w:r>
       <w:r>
         <w:rPr>
-          <w:rtl w:val="0"/>
+          <w:lang w:val="en-US"/>
         </w:rPr>
         <w:t xml:space="preserve"> </w:t>
       </w:r>
       <w:r>
         <w:rPr>
-          <w:i/>
-          <w:iCs/>
-          <w:rtl w:val="0"/>
+          <w:i w:val="1"/>
+          <w:iCs w:val="1"/>
+          <w:lang w:val="en-US"/>
         </w:rPr>
         <w:t xml:space="preserve">Automação de Pendências (Carry-over).</w:t>
       </w:r>
       <w:r>
         <w:rPr>
-          <w:rtl w:val="0"/>
+          <w:lang w:val="en-US"/>
         </w:rPr>
         <w:t xml:space="preserve"> O sistema possui uma inteligência de acompanhamento projetada p</w:t>
       </w:r>
       <w:r>
         <w:rPr>
-          <w:rtl w:val="0"/>
+          <w:lang w:val="en-US"/>
         </w:rPr>
         <w:t xml:space="preserve">ara evitar que decisões se percam no tempo. Se uma tarefa gerada em um encontro não for marcada como concluída, o Fellow automaticamente puxa (transfere) essa mesma pendência para a pauta da próxima reunião daquele grupo, automatizando a cobrança contínua.</w:t>
       </w:r>
       <w:r/>
     </w:p>
-    <w:p>
+    <w:p xmlns:wp14="http://schemas.microsoft.com/office/word/2010/wordml" wp14:textId="77777777">
       <w:pPr>
         <w:numPr>
           <w:ilvl w:val="0"/>
@@ -1330,7 +1295,7 @@
         </w:numPr>
         <w:pBdr/>
         <w:spacing w:after="0"/>
-        <w:ind w:hanging="360" w:left="720"/>
+        <w:ind w:left="720" w:hanging="360"/>
         <w:rPr/>
       </w:pPr>
       <w:r>
@@ -1348,79 +1313,75 @@
       </w:r>
       <w:r/>
     </w:p>
-    <w:p>
+    <w:p xmlns:wp14="http://schemas.microsoft.com/office/word/2010/wordml" wp14:textId="77777777">
       <w:pPr>
         <w:numPr>
           <w:ilvl w:val="1"/>
           <w:numId w:val="4"/>
         </w:numPr>
-        <w:pBdr/>
         <w:spacing w:after="0"/>
-        <w:ind w:hanging="360" w:left="1440"/>
+        <w:ind w:left="1440" w:hanging="360"/>
         <w:rPr/>
       </w:pPr>
       <w:r>
         <w:rPr>
-          <w:rtl w:val="0"/>
+          <w:lang w:val="en-US"/>
         </w:rPr>
         <w:t xml:space="preserve">Possui uma vasta biblioteca de modelos integrados, disponibilizando templates práticos para avaliações de desempenho ou reuniões de alinhamento rápido.</w:t>
       </w:r>
       <w:r/>
     </w:p>
-    <w:p>
+    <w:p xmlns:wp14="http://schemas.microsoft.com/office/word/2010/wordml" wp14:textId="77777777">
       <w:pPr>
         <w:numPr>
           <w:ilvl w:val="1"/>
           <w:numId w:val="4"/>
         </w:numPr>
-        <w:pBdr/>
         <w:spacing w:after="0"/>
-        <w:ind w:hanging="360" w:left="1440"/>
+        <w:ind w:left="1440" w:hanging="360"/>
         <w:rPr/>
       </w:pPr>
       <w:r>
         <w:rPr>
-          <w:rtl w:val="0"/>
+          <w:lang w:val="en-US"/>
         </w:rPr>
         <w:t xml:space="preserve">Insere o contexto da pauta diretamente nas ferramentas de trabalho diário da equipe por meio de integrações profundas com Slack, Jira, Microsoft Teams e Google Workspace.</w:t>
       </w:r>
       <w:r/>
     </w:p>
-    <w:p>
+    <w:p xmlns:wp14="http://schemas.microsoft.com/office/word/2010/wordml" wp14:textId="77777777">
       <w:pPr>
         <w:numPr>
           <w:ilvl w:val="1"/>
           <w:numId w:val="4"/>
         </w:numPr>
-        <w:pBdr/>
         <w:spacing w:after="0"/>
-        <w:ind w:hanging="360" w:left="1440"/>
+        <w:ind w:left="1440" w:hanging="360"/>
         <w:rPr/>
       </w:pPr>
       <w:r>
         <w:rPr>
-          <w:rtl w:val="0"/>
+          <w:lang w:val="en-US"/>
         </w:rPr>
         <w:t xml:space="preserve">Garante que os participantes saibam exatamente o que será discutido antes do encontro por meio da construção colaborativa de pautas e atas.</w:t>
       </w:r>
       <w:r/>
     </w:p>
-    <w:p>
+    <w:p xmlns:wp14="http://schemas.microsoft.com/office/word/2010/wordml" wp14:textId="77777777">
       <w:pPr>
         <w:numPr>
           <w:ilvl w:val="0"/>
           <w:numId w:val="4"/>
         </w:numPr>
-        <w:pBdr/>
         <w:spacing w:after="0"/>
-        <w:ind w:hanging="360" w:left="720"/>
+        <w:ind w:left="720" w:hanging="360"/>
         <w:rPr/>
       </w:pPr>
       <w:r>
         <w:rPr>
-          <w:b/>
-          <w:bCs/>
-          <w:rtl w:val="0"/>
+          <w:b w:val="1"/>
+          <w:bCs w:val="1"/>
+          <w:lang w:val="en-US"/>
         </w:rPr>
         <w:t xml:space="preserve">Pontos Fracos:</w:t>
       </w:r>
@@ -1431,65 +1392,63 @@
       </w:r>
       <w:r/>
     </w:p>
-    <w:p>
+    <w:p xmlns:wp14="http://schemas.microsoft.com/office/word/2010/wordml" wp14:textId="77777777">
       <w:pPr>
         <w:numPr>
           <w:ilvl w:val="1"/>
           <w:numId w:val="7"/>
         </w:numPr>
-        <w:pBdr/>
         <w:spacing w:after="240" w:line="276" w:lineRule="auto"/>
-        <w:ind w:hanging="360" w:left="1440"/>
+        <w:ind w:left="1440" w:hanging="360"/>
         <w:rPr/>
       </w:pPr>
-      <w:r/>
       <w:r>
         <w:rPr>
-          <w:rtl w:val="0"/>
+          <w:lang w:val="en-US"/>
         </w:rPr>
         <w:t xml:space="preserve">O modelo comercial baseado em SaaS (</w:t>
       </w:r>
       <w:r>
         <w:rPr>
-          <w:i/>
-          <w:iCs/>
-          <w:rtl w:val="0"/>
+          <w:i w:val="1"/>
+          <w:iCs w:val="1"/>
+          <w:lang w:val="en-US"/>
         </w:rPr>
         <w:t xml:space="preserve">Software as a Service</w:t>
       </w:r>
       <w:r>
         <w:rPr>
-          <w:rtl w:val="0"/>
+          <w:lang w:val="en-US"/>
         </w:rPr>
         <w:t xml:space="preserve">, ou Software como Serviço) bloqueia funções avançadas atrás de assinaturas pagas, gerando barr</w:t>
       </w:r>
       <w:r>
         <w:rPr>
-          <w:rtl w:val="0"/>
+          <w:lang w:val="en-US"/>
         </w:rPr>
         <w:t xml:space="preserve">eira financeira para times pequenos. Na prática, isso significa que usuários de planos gratuitos ou básicos perdem acesso a recursos essenciais para o longo prazo, como o histórico completo de reuniões antigas (que costuma ser apagado ou bloqueado após alg</w:t>
       </w:r>
       <w:r>
         <w:rPr>
-          <w:rtl w:val="0"/>
+          <w:lang w:val="en-US"/>
         </w:rPr>
         <w:t xml:space="preserve">uns dias), a impossibilidade de exportar atas, a restrição de integrações vitais com gerenciadores de projetos (como o Jira) e o bloqueio de painéis de análise e relatórios de produtividade, obrigando a empresa a pagar para ter o ciclo de gestão completo. </w:t>
       </w:r>
       <w:r/>
       <w:r/>
     </w:p>
-    <w:p>
+    <w:p xmlns:wp14="http://schemas.microsoft.com/office/word/2010/wordml" wp14:textId="77777777">
       <w:pPr>
         <w:pBdr/>
         <w:spacing w:after="240" w:line="276" w:lineRule="auto"/>
-        <w:ind w:firstLine="0" w:left="1440"/>
+        <w:ind w:left="1440" w:firstLine="0"/>
         <w:rPr/>
       </w:pPr>
       <w:r>
         <mc:AlternateContent>
           <mc:Choice Requires="wpg">
             <w:drawing>
-              <wp:inline xmlns:wp="http://schemas.openxmlformats.org/drawingml/2006/wordprocessingDrawing" distT="0" distB="0" distL="0" distR="0">
+              <wp:inline xmlns:wp="http://schemas.openxmlformats.org/drawingml/2006/wordprocessingDrawing" xmlns:wp14="http://schemas.microsoft.com/office/word/2010/wordprocessingDrawing" distT="0" distB="0" distL="0" distR="0" wp14:anchorId="4896F381" wp14:editId="7777777">
                 <wp:extent cx="5569212" cy="3117405"/>
                 <wp:effectExtent l="0" t="0" r="0" b="0"/>
                 <wp:docPr id="3" name="image2.png"/>
@@ -1524,8 +1483,8 @@
             </w:drawing>
           </mc:Choice>
           <mc:Fallback>
-            <w:pict>
-              <v:shapetype id="_x0000_t75" coordsize="21600,21600" o:spt="75" o:preferrelative="t" path="m@4@5l@4@11@9@11@9@5xe" filled="f" stroked="f">
+            <w:pict w14:anchorId="22EF6AA4">
+              <v:shapetype id="_x0000_t75" coordsize="21600,21600" filled="f" stroked="f" o:spt="75" o:preferrelative="t" path="m@4@5l@4@11@9@11@9@5xe">
                 <v:stroke joinstyle="miter"/>
                 <v:formulas>
                   <v:f eqn="if lineDrawn pixelLineWidth 0"/>
@@ -1541,11 +1500,11 @@
                   <v:f eqn="prod @7 21600 pixelHeight"/>
                   <v:f eqn="sum @10 21600 0"/>
                 </v:formulas>
-                <v:path o:extrusionok="f" gradientshapeok="t" o:connecttype="rect"/>
+                <v:path gradientshapeok="t" o:connecttype="rect" o:extrusionok="f"/>
                 <o:lock v:ext="edit" aspectratio="t"/>
               </v:shapetype>
-              <v:shape id="_x0000_i2" o:spid="_x0000_s2" type="#_x0000_t75" style="width:438.52pt;height:245.46pt;mso-wrap-distance-left:0.00pt;mso-wrap-distance-top:0.00pt;mso-wrap-distance-right:0.00pt;mso-wrap-distance-bottom:0.00pt;z-index:1;">
-                <v:imagedata r:id="rId11" o:title="" croptop="0f" cropleft="0f" cropbottom="0f" cropright="0f"/>
+              <v:shape id="_x0000_i2" style="width:438.52pt;height:245.46pt;mso-wrap-distance-left:0.00pt;mso-wrap-distance-top:0.00pt;mso-wrap-distance-right:0.00pt;mso-wrap-distance-bottom:0.00pt;z-index:1;" o:spid="_x0000_s2" type="#_x0000_t75">
+                <v:imagedata cropleft="0f" croptop="0f" cropright="0f" cropbottom="0f" o:title="" r:id="rId11"/>
                 <o:lock v:ext="edit" rotation="t"/>
               </v:shape>
             </w:pict>
@@ -1555,18 +1514,18 @@
       <w:r/>
       <w:r/>
     </w:p>
-    <w:p>
+    <w:p xmlns:wp14="http://schemas.microsoft.com/office/word/2010/wordml" wp14:textId="77777777">
       <w:pPr>
         <w:pBdr/>
         <w:spacing w:after="240" w:line="276" w:lineRule="auto"/>
-        <w:ind w:firstLine="0" w:left="1440"/>
+        <w:ind w:left="1440" w:firstLine="0"/>
         <w:rPr/>
       </w:pPr>
       <w:r>
         <mc:AlternateContent>
           <mc:Choice Requires="wpg">
             <w:drawing>
-              <wp:inline xmlns:wp="http://schemas.openxmlformats.org/drawingml/2006/wordprocessingDrawing" distT="0" distB="0" distL="0" distR="0">
+              <wp:inline xmlns:wp="http://schemas.openxmlformats.org/drawingml/2006/wordprocessingDrawing" xmlns:wp14="http://schemas.microsoft.com/office/word/2010/wordprocessingDrawing" distT="0" distB="0" distL="0" distR="0" wp14:anchorId="11474AD9" wp14:editId="7777777">
                 <wp:extent cx="5618749" cy="3606629"/>
                 <wp:effectExtent l="0" t="0" r="0" b="0"/>
                 <wp:docPr id="4" name="image1.png"/>
@@ -1601,8 +1560,8 @@
             </w:drawing>
           </mc:Choice>
           <mc:Fallback>
-            <w:pict>
-              <v:shapetype id="_x0000_t75" coordsize="21600,21600" o:spt="75" o:preferrelative="t" path="m@4@5l@4@11@9@11@9@5xe" filled="f" stroked="f">
+            <w:pict w14:anchorId="515FC577">
+              <v:shapetype id="_x0000_t75" coordsize="21600,21600" filled="f" stroked="f" o:spt="75" o:preferrelative="t" path="m@4@5l@4@11@9@11@9@5xe">
                 <v:stroke joinstyle="miter"/>
                 <v:formulas>
                   <v:f eqn="if lineDrawn pixelLineWidth 0"/>
@@ -1618,11 +1577,11 @@
                   <v:f eqn="prod @7 21600 pixelHeight"/>
                   <v:f eqn="sum @10 21600 0"/>
                 </v:formulas>
-                <v:path o:extrusionok="f" gradientshapeok="t" o:connecttype="rect"/>
+                <v:path gradientshapeok="t" o:connecttype="rect" o:extrusionok="f"/>
                 <o:lock v:ext="edit" aspectratio="t"/>
               </v:shapetype>
-              <v:shape id="_x0000_i3" o:spid="_x0000_s3" type="#_x0000_t75" style="width:442.42pt;height:283.99pt;mso-wrap-distance-left:0.00pt;mso-wrap-distance-top:0.00pt;mso-wrap-distance-right:0.00pt;mso-wrap-distance-bottom:0.00pt;z-index:1;">
-                <v:imagedata r:id="rId12" o:title="" croptop="0f" cropleft="0f" cropbottom="0f" cropright="0f"/>
+              <v:shape id="_x0000_i3" style="width:442.42pt;height:283.99pt;mso-wrap-distance-left:0.00pt;mso-wrap-distance-top:0.00pt;mso-wrap-distance-right:0.00pt;mso-wrap-distance-bottom:0.00pt;z-index:1;" o:spid="_x0000_s3" type="#_x0000_t75">
+                <v:imagedata cropleft="0f" croptop="0f" cropright="0f" cropbottom="0f" o:title="" r:id="rId12"/>
                 <o:lock v:ext="edit" rotation="t"/>
               </v:shape>
             </w:pict>
@@ -1632,37 +1591,35 @@
       <w:r/>
       <w:r/>
     </w:p>
-    <w:p>
-      <w:pPr>
-        <w:pBdr/>
+    <w:p xmlns:wp14="http://schemas.microsoft.com/office/word/2010/wordml" wp14:textId="77777777">
+      <w:pPr>
         <w:spacing w:after="240" w:line="276" w:lineRule="auto"/>
-        <w:ind w:firstLine="0" w:left="1440"/>
-        <w:rPr/>
+        <w:ind w:left="1440" w:firstLine="0"/>
       </w:pPr>
       <w:r>
         <w:rPr>
-          <w:rtl w:val="0"/>
+          <w:lang w:val="en-US"/>
         </w:rPr>
         <w:t xml:space="preserve">Link da imagem: </w:t>
       </w:r>
-      <w:hyperlink r:id="rId13" w:tooltip="https://fellow.ai/integrations" w:history="1">
+      <w:hyperlink r:id="R6f60bddc263a449d">
         <w:r>
           <w:rPr>
-            <w:color w:val="1155cc"/>
+            <w:color w:val="1155CC"/>
             <w:u w:val="single"/>
-            <w:rtl w:val="0"/>
+            <w:lang w:val="en-US"/>
           </w:rPr>
-          <w:t xml:space="preserve">More integrations</w:t>
+          <w:t>More integrations</w:t>
         </w:r>
       </w:hyperlink>
       <w:r/>
       <w:r/>
     </w:p>
-    <w:p>
+    <w:p xmlns:wp14="http://schemas.microsoft.com/office/word/2010/wordml" wp14:textId="77777777">
       <w:pPr>
         <w:pBdr/>
         <w:spacing w:after="0"/>
-        <w:ind w:firstLine="0" w:left="720"/>
+        <w:ind w:left="720" w:firstLine="0"/>
         <w:rPr/>
       </w:pPr>
       <w:r>
@@ -1673,22 +1630,22 @@
       <w:r/>
       <w:r/>
     </w:p>
-    <w:p>
-      <w:pPr>
-        <w:pBdr/>
+    <w:p xmlns:wp14="http://schemas.microsoft.com/office/word/2010/wordml" wp14:textId="77777777">
+      <w:pPr>
         <w:spacing w:after="240"/>
         <w:ind/>
         <w:jc w:val="both"/>
         <w:rPr>
-          <w:b/>
-          <w:bCs/>
+          <w:b w:val="1"/>
+          <w:bCs w:val="1"/>
+          <w:lang w:val="en-US"/>
         </w:rPr>
       </w:pPr>
       <w:r>
         <w:rPr>
-          <w:b/>
-          <w:bCs/>
-          <w:rtl w:val="0"/>
+          <w:b w:val="1"/>
+          <w:bCs w:val="1"/>
+          <w:lang w:val="en-US"/>
         </w:rPr>
         <w:t xml:space="preserve">5. Hypercontext</w:t>
       </w:r>
@@ -1699,95 +1656,93 @@
         </w:rPr>
       </w:r>
     </w:p>
-    <w:p>
+    <w:p xmlns:wp14="http://schemas.microsoft.com/office/word/2010/wordml" wp14:textId="77777777">
       <w:pPr>
         <w:numPr>
           <w:ilvl w:val="0"/>
           <w:numId w:val="1"/>
         </w:numPr>
-        <w:pBdr/>
         <w:spacing w:after="0"/>
-        <w:ind w:hanging="360" w:left="720"/>
+        <w:ind w:left="720" w:hanging="360"/>
         <w:rPr/>
       </w:pPr>
       <w:r>
         <w:rPr>
-          <w:b/>
-          <w:bCs/>
-          <w:rtl w:val="0"/>
+          <w:b w:val="1"/>
+          <w:bCs w:val="1"/>
+          <w:lang w:val="en-US"/>
         </w:rPr>
         <w:t xml:space="preserve">Breve Descrição:</w:t>
       </w:r>
       <w:r>
         <w:rPr>
-          <w:rtl w:val="0"/>
+          <w:lang w:val="en-US"/>
         </w:rPr>
         <w:t xml:space="preserve"> Plataforma focada em estruturar todo o ciclo de reuniões, especialmente reuniões 1:1 e de gestão, alinhando as pautas e tarefas às metas da empresa.</w:t>
       </w:r>
       <w:r/>
     </w:p>
-    <w:p>
+    <w:p xmlns:wp14="http://schemas.microsoft.com/office/word/2010/wordml" wp14:textId="77777777">
       <w:pPr>
         <w:numPr>
           <w:ilvl w:val="0"/>
           <w:numId w:val="1"/>
         </w:numPr>
-        <w:pBdr/>
         <w:spacing w:after="0"/>
-        <w:ind w:hanging="360" w:left="720"/>
+        <w:ind w:left="720" w:hanging="360"/>
         <w:rPr/>
       </w:pPr>
       <w:r>
         <w:rPr>
-          <w:b/>
-          <w:bCs/>
-          <w:rtl w:val="0"/>
+          <w:b w:val="1"/>
+          <w:bCs w:val="1"/>
+          <w:lang w:val="en-US"/>
         </w:rPr>
         <w:t xml:space="preserve">Diferencial de Destaque:</w:t>
       </w:r>
       <w:r>
         <w:rPr>
-          <w:rtl w:val="0"/>
+          <w:lang w:val="en-US"/>
         </w:rPr>
         <w:t xml:space="preserve"> </w:t>
       </w:r>
       <w:r>
         <w:rPr>
-          <w:i/>
-          <w:iCs/>
-          <w:rtl w:val="0"/>
+          <w:i w:val="1"/>
+          <w:iCs w:val="1"/>
+          <w:lang w:val="en-US"/>
         </w:rPr>
         <w:t xml:space="preserve">Conexão Direta com Metas e OKRs.</w:t>
       </w:r>
       <w:r>
         <w:rPr>
-          <w:rtl w:val="0"/>
+          <w:lang w:val="en-US"/>
         </w:rPr>
         <w:t xml:space="preserve"> O grande trunfo do Hypercontext é</w:t>
       </w:r>
       <w:r>
         <w:rPr>
-          <w:rtl w:val="0"/>
+          <w:lang w:val="en-US"/>
         </w:rPr>
         <w:t xml:space="preserve"> atrelar o conteúdo da reunião aos objetivos gerais da organização. Ao invés de o encontro ser um mero acompanhamento de tarefas operacionais, o sistema permite vincular as pautas e decisões às metas da equipe, frequentemente utilizando a metodologia OKR (</w:t>
       </w:r>
       <w:r>
         <w:rPr>
-          <w:i/>
-          <w:iCs/>
-          <w:rtl w:val="0"/>
+          <w:i w:val="1"/>
+          <w:iCs w:val="1"/>
+          <w:lang w:val="en-US"/>
         </w:rPr>
         <w:t xml:space="preserve">Objectives and Key Results</w:t>
       </w:r>
       <w:r>
         <w:rPr>
-          <w:rtl w:val="0"/>
+          <w:lang w:val="en-US"/>
         </w:rPr>
         <w:t xml:space="preserve">, ou Objetivos e Resultados-Chave). Isso garante que o tempo investido na conversa esteja gerando valor estratégico e mensurável.</w:t>
       </w:r>
       <w:r/>
     </w:p>
-    <w:p>
+    <w:p xmlns:wp14="http://schemas.microsoft.com/office/word/2010/wordml" wp14:textId="77777777">
       <w:pPr>
         <w:numPr>
           <w:ilvl w:val="0"/>
@@ -1795,7 +1750,7 @@
         </w:numPr>
         <w:pBdr/>
         <w:spacing w:after="0"/>
-        <w:ind w:hanging="360" w:left="720"/>
+        <w:ind w:left="720" w:hanging="360"/>
         <w:rPr/>
       </w:pPr>
       <w:r>
@@ -1813,79 +1768,75 @@
       </w:r>
       <w:r/>
     </w:p>
-    <w:p>
+    <w:p xmlns:wp14="http://schemas.microsoft.com/office/word/2010/wordml" wp14:textId="77777777">
       <w:pPr>
         <w:numPr>
           <w:ilvl w:val="1"/>
           <w:numId w:val="1"/>
         </w:numPr>
-        <w:pBdr/>
         <w:spacing w:after="0"/>
-        <w:ind w:hanging="360" w:left="1440"/>
+        <w:ind w:left="1440" w:hanging="360"/>
         <w:rPr/>
       </w:pPr>
       <w:r>
         <w:rPr>
-          <w:rtl w:val="0"/>
+          <w:lang w:val="en-US"/>
         </w:rPr>
         <w:t xml:space="preserve">As agendas são altamente colaborativas, permitindo que qualquer participante adicione assuntos previamente, garantindo objetividade antes mesmo do encontro começar.</w:t>
       </w:r>
       <w:r/>
     </w:p>
-    <w:p>
+    <w:p xmlns:wp14="http://schemas.microsoft.com/office/word/2010/wordml" wp14:textId="77777777">
       <w:pPr>
         <w:numPr>
           <w:ilvl w:val="1"/>
           <w:numId w:val="1"/>
         </w:numPr>
-        <w:pBdr/>
         <w:spacing w:after="0"/>
-        <w:ind w:hanging="360" w:left="1440"/>
+        <w:ind w:left="1440" w:hanging="360"/>
         <w:rPr/>
       </w:pPr>
       <w:r>
         <w:rPr>
-          <w:rtl w:val="0"/>
+          <w:lang w:val="en-US"/>
         </w:rPr>
         <w:t xml:space="preserve">Oferece perguntas e sugestões de conversa para ajudar a evitar que reuniões recorrentes se tornem repetitivas.</w:t>
       </w:r>
       <w:r/>
     </w:p>
-    <w:p>
+    <w:p xmlns:wp14="http://schemas.microsoft.com/office/word/2010/wordml" wp14:textId="77777777">
       <w:pPr>
         <w:numPr>
           <w:ilvl w:val="1"/>
           <w:numId w:val="1"/>
         </w:numPr>
-        <w:pBdr/>
         <w:spacing w:after="0"/>
-        <w:ind w:hanging="360" w:left="1440"/>
+        <w:ind w:left="1440" w:hanging="360"/>
         <w:rPr/>
       </w:pPr>
       <w:r>
         <w:rPr>
-          <w:rtl w:val="0"/>
+          <w:lang w:val="en-US"/>
         </w:rPr>
         <w:t xml:space="preserve">Mantém o histórico, as notas e as decisões organizados em um único ambiente, facilitando a atribuição direta dos próximos passos.</w:t>
       </w:r>
       <w:r/>
     </w:p>
-    <w:p>
+    <w:p xmlns:wp14="http://schemas.microsoft.com/office/word/2010/wordml" wp14:textId="77777777">
       <w:pPr>
         <w:numPr>
           <w:ilvl w:val="0"/>
           <w:numId w:val="1"/>
         </w:numPr>
-        <w:pBdr/>
         <w:spacing w:after="0"/>
-        <w:ind w:hanging="360" w:left="720"/>
+        <w:ind w:left="720" w:hanging="360"/>
         <w:rPr/>
       </w:pPr>
       <w:r>
         <w:rPr>
-          <w:b/>
-          <w:bCs/>
-          <w:rtl w:val="0"/>
+          <w:b w:val="1"/>
+          <w:bCs w:val="1"/>
+          <w:lang w:val="en-US"/>
         </w:rPr>
         <w:t xml:space="preserve">Pontos Fracos:</w:t>
       </w:r>
@@ -1896,40 +1847,38 @@
       </w:r>
       <w:r/>
     </w:p>
-    <w:p>
+    <w:p xmlns:wp14="http://schemas.microsoft.com/office/word/2010/wordml" wp14:textId="77777777">
       <w:pPr>
         <w:numPr>
           <w:ilvl w:val="1"/>
           <w:numId w:val="6"/>
         </w:numPr>
-        <w:pBdr/>
-        <w:spacing w:after="0" w:afterAutospacing="0" w:line="276" w:lineRule="auto"/>
-        <w:ind w:hanging="360" w:left="1440"/>
+        <w:spacing w:after="0" w:afterAutospacing="off" w:line="276" w:lineRule="auto"/>
+        <w:ind w:left="1440" w:hanging="360"/>
         <w:rPr/>
       </w:pPr>
       <w:r>
         <w:rPr>
-          <w:rtl w:val="0"/>
+          <w:lang w:val="en-US"/>
         </w:rPr>
         <w:t xml:space="preserve">Torna-se exagerado e complexo para equipes que realizam reuniões simples ou com pouca frequência, onde um documento simples já resolveria a necessidade.</w:t>
       </w:r>
       <w:r/>
       <w:r/>
     </w:p>
-    <w:p>
+    <w:p xmlns:wp14="http://schemas.microsoft.com/office/word/2010/wordml" wp14:textId="77777777">
       <w:pPr>
         <w:numPr>
           <w:ilvl w:val="1"/>
           <w:numId w:val="6"/>
         </w:numPr>
-        <w:pBdr/>
-        <w:spacing w:after="0" w:afterAutospacing="0" w:line="276" w:lineRule="auto"/>
-        <w:ind w:hanging="360" w:left="1440"/>
+        <w:spacing w:after="0" w:afterAutospacing="off" w:line="276" w:lineRule="auto"/>
+        <w:ind w:left="1440" w:hanging="360"/>
         <w:rPr/>
       </w:pPr>
       <w:r>
         <w:rPr>
-          <w:rtl w:val="0"/>
+          <w:lang w:val="en-US"/>
         </w:rPr>
         <w:t xml:space="preserve">O gerenciamento de tarefas é limitado quando comparado a softwares especialistas em projetos, não lidando bem com dependências e planejamentos mais avançados.</w:t>
       </w:r>
@@ -1942,77 +1891,343 @@
           <w:ilvl w:val="1"/>
           <w:numId w:val="6"/>
         </w:numPr>
-        <w:pBdr/>
         <w:spacing w:after="240" w:line="276" w:lineRule="auto"/>
-        <w:ind w:hanging="360" w:left="1440"/>
-        <w:rPr/>
+        <w:ind w:left="1440" w:hanging="360"/>
+        <w:rPr>
+          <w:lang w:val="pt-BR"/>
+        </w:rPr>
       </w:pPr>
       <w:r>
         <w:rPr>
-          <w:rtl w:val="0"/>
+          <w:lang w:val="pt-BR"/>
         </w:rPr>
-        <w:t xml:space="preserve">Gera forte dependência da ferramenta (</w:t>
+        <w:t xml:space="preserve">Gera forte </w:t>
       </w:r>
       <w:r>
         <w:rPr>
-          <w:i/>
-          <w:iCs/>
-          <w:rtl w:val="0"/>
+          <w:lang w:val="pt-BR"/>
         </w:rPr>
-        <w:t xml:space="preserve">vendor lock-in</w:t>
+        <w:t>dependência</w:t>
       </w:r>
       <w:r>
         <w:rPr>
-          <w:rtl w:val="0"/>
+          <w:lang w:val="pt-BR"/>
         </w:rPr>
-        <w:t xml:space="preserve">) ao armazenar o histórico de decisões em um formato próprio e limita recursos importantes aos planos pagos.</w:t>
+        <w:t xml:space="preserve"> da ferramenta (</w:t>
       </w:r>
-      <w:r/>
-      <w:r/>
+      <w:r>
+        <w:rPr>
+          <w:i w:val="1"/>
+          <w:iCs w:val="1"/>
+          <w:lang w:val="pt-BR"/>
+        </w:rPr>
+        <w:t>vendor lock-in</w:t>
+      </w:r>
+      <w:r>
+        <w:rPr>
+          <w:lang w:val="pt-BR"/>
+        </w:rPr>
+        <w:t xml:space="preserve">) </w:t>
+      </w:r>
+      <w:r>
+        <w:rPr>
+          <w:lang w:val="pt-BR"/>
+        </w:rPr>
+        <w:t>ao</w:t>
+      </w:r>
+      <w:r>
+        <w:rPr>
+          <w:lang w:val="pt-BR"/>
+        </w:rPr>
+        <w:t xml:space="preserve"> </w:t>
+      </w:r>
+      <w:r>
+        <w:rPr>
+          <w:lang w:val="pt-BR"/>
+        </w:rPr>
+        <w:t>armazenar</w:t>
+      </w:r>
+      <w:r>
+        <w:rPr>
+          <w:lang w:val="pt-BR"/>
+        </w:rPr>
+        <w:t xml:space="preserve"> o histórico de </w:t>
+      </w:r>
+      <w:r>
+        <w:rPr>
+          <w:lang w:val="pt-BR"/>
+        </w:rPr>
+        <w:t>decisões</w:t>
+      </w:r>
+      <w:r>
+        <w:rPr>
+          <w:lang w:val="pt-BR"/>
+        </w:rPr>
+        <w:t xml:space="preserve"> </w:t>
+      </w:r>
+      <w:r>
+        <w:rPr>
+          <w:lang w:val="pt-BR"/>
+        </w:rPr>
+        <w:t>em</w:t>
+      </w:r>
+      <w:r>
+        <w:rPr>
+          <w:lang w:val="pt-BR"/>
+        </w:rPr>
+        <w:t xml:space="preserve"> um </w:t>
+      </w:r>
+      <w:r>
+        <w:rPr>
+          <w:lang w:val="pt-BR"/>
+        </w:rPr>
+        <w:t>formato</w:t>
+      </w:r>
+      <w:r>
+        <w:rPr>
+          <w:lang w:val="pt-BR"/>
+        </w:rPr>
+        <w:t xml:space="preserve"> </w:t>
+      </w:r>
+      <w:r>
+        <w:rPr>
+          <w:lang w:val="pt-BR"/>
+        </w:rPr>
+        <w:t>próprio</w:t>
+      </w:r>
+      <w:r>
+        <w:rPr>
+          <w:lang w:val="pt-BR"/>
+        </w:rPr>
+        <w:t xml:space="preserve"> e </w:t>
+      </w:r>
+      <w:r>
+        <w:rPr>
+          <w:lang w:val="pt-BR"/>
+        </w:rPr>
+        <w:t>limita</w:t>
+      </w:r>
+      <w:r>
+        <w:rPr>
+          <w:lang w:val="pt-BR"/>
+        </w:rPr>
+        <w:t xml:space="preserve"> </w:t>
+      </w:r>
+      <w:r>
+        <w:rPr>
+          <w:lang w:val="pt-BR"/>
+        </w:rPr>
+        <w:t>recursos</w:t>
+      </w:r>
+      <w:r>
+        <w:rPr>
+          <w:lang w:val="pt-BR"/>
+        </w:rPr>
+        <w:t xml:space="preserve"> </w:t>
+      </w:r>
+      <w:r>
+        <w:rPr>
+          <w:lang w:val="pt-BR"/>
+        </w:rPr>
+        <w:t>importantes</w:t>
+      </w:r>
+      <w:r>
+        <w:rPr>
+          <w:lang w:val="pt-BR"/>
+        </w:rPr>
+        <w:t xml:space="preserve"> </w:t>
+      </w:r>
+      <w:r>
+        <w:rPr>
+          <w:lang w:val="pt-BR"/>
+        </w:rPr>
+        <w:t>aos</w:t>
+      </w:r>
+      <w:r>
+        <w:rPr>
+          <w:lang w:val="pt-BR"/>
+        </w:rPr>
+        <w:t xml:space="preserve"> </w:t>
+      </w:r>
+      <w:r>
+        <w:rPr>
+          <w:lang w:val="pt-BR"/>
+        </w:rPr>
+        <w:t>planos</w:t>
+      </w:r>
+      <w:r>
+        <w:rPr>
+          <w:lang w:val="pt-BR"/>
+        </w:rPr>
+        <w:t xml:space="preserve"> </w:t>
+      </w:r>
+      <w:r>
+        <w:rPr>
+          <w:lang w:val="pt-BR"/>
+        </w:rPr>
+        <w:t>pagos</w:t>
+      </w:r>
+      <w:r>
+        <w:rPr>
+          <w:lang w:val="pt-BR"/>
+        </w:rPr>
+        <w:t>.</w:t>
+      </w:r>
     </w:p>
     <w:p>
       <w:pPr>
-        <w:pBdr/>
         <w:spacing w:after="240" w:line="276" w:lineRule="auto"/>
-        <w:ind w:firstLine="0" w:left="1440"/>
-        <w:rPr/>
+        <w:ind w:left="1440" w:firstLine="0"/>
+        <w:jc w:val="center"/>
       </w:pPr>
       <w:r>
-        <w:rPr>
-          <w:rtl w:val="0"/>
-        </w:rPr>
+        <w:drawing>
+          <wp:anchor distT="0" distB="0" distL="114300" distR="114300" simplePos="0" relativeHeight="251658240" behindDoc="0" locked="0" layoutInCell="1" allowOverlap="1" wp14:editId="1FF3020D" wp14:anchorId="38E7EDEE">
+            <wp:simplePos x="0" y="0"/>
+            <wp:positionH relativeFrom="column">
+              <wp:align>right</wp:align>
+            </wp:positionH>
+            <wp:positionV relativeFrom="paragraph">
+              <wp:posOffset>0</wp:posOffset>
+            </wp:positionV>
+            <wp:extent cx="5943600" cy="3162300"/>
+            <wp:effectExtent l="0" t="0" r="0" b="0"/>
+            <wp:wrapSquare wrapText="bothSides"/>
+            <wp:docPr id="250800192" name="drawing"/>
+            <wp:cNvGraphicFramePr>
+              <a:graphicFrameLocks noChangeAspect="1"/>
+            </wp:cNvGraphicFramePr>
+            <a:graphic>
+              <a:graphicData xmlns:a="http://schemas.openxmlformats.org/drawingml/2006/main" uri="http://schemas.openxmlformats.org/drawingml/2006/picture">
+                <pic:pic xmlns:pic="http://schemas.openxmlformats.org/drawingml/2006/picture">
+                  <pic:nvPicPr>
+                    <pic:cNvPr id="250800192" name="Picture 250800192"/>
+                    <pic:cNvPicPr/>
+                  </pic:nvPicPr>
+                  <pic:blipFill>
+                    <a:blip xmlns:r="http://schemas.openxmlformats.org/officeDocument/2006/relationships" r:embed="rId918305118">
+                      <a:extLst>
+                        <a:ext uri="{28A0092B-C50C-407E-A947-70E740481C1C}">
+                          <a14:useLocalDpi xmlns:a14="http://schemas.microsoft.com/office/drawing/2010/main"/>
+                        </a:ext>
+                      </a:extLst>
+                    </a:blip>
+                    <a:stretch>
+                      <a:fillRect/>
+                    </a:stretch>
+                  </pic:blipFill>
+                  <pic:spPr>
+                    <a:xfrm>
+                      <a:off x="0" y="0"/>
+                      <a:ext cx="5943600" cy="3162300"/>
+                    </a:xfrm>
+                    <a:prstGeom prst="rect">
+                      <a:avLst/>
+                    </a:prstGeom>
+                  </pic:spPr>
+                </pic:pic>
+              </a:graphicData>
+            </a:graphic>
+            <wp14:sizeRelH relativeFrom="page">
+              <wp14:pctWidth>0</wp14:pctWidth>
+            </wp14:sizeRelH>
+            <wp14:sizeRelV relativeFrom="page">
+              <wp14:pctHeight>0</wp14:pctHeight>
+            </wp14:sizeRelV>
+          </wp:anchor>
+        </w:drawing>
       </w:r>
-      <w:r/>
     </w:p>
     <w:p>
       <w:pPr>
+        <w:spacing w:after="240" w:line="276" w:lineRule="auto"/>
+        <w:ind w:left="1440" w:firstLine="0"/>
+      </w:pPr>
+      <w:r>
+        <w:drawing>
+          <wp:anchor distT="0" distB="0" distL="114300" distR="114300" simplePos="0" relativeHeight="251658240" behindDoc="0" locked="0" layoutInCell="1" allowOverlap="1" wp14:editId="71A2587A" wp14:anchorId="22D055C8">
+            <wp:simplePos x="0" y="0"/>
+            <wp:positionH relativeFrom="column">
+              <wp:align>right</wp:align>
+            </wp:positionH>
+            <wp:positionV relativeFrom="paragraph">
+              <wp:posOffset>0</wp:posOffset>
+            </wp:positionV>
+            <wp:extent cx="5943600" cy="3343275"/>
+            <wp:effectExtent l="0" t="0" r="0" b="0"/>
+            <wp:wrapSquare wrapText="bothSides"/>
+            <wp:docPr id="357675207" name="drawing"/>
+            <wp:cNvGraphicFramePr>
+              <a:graphicFrameLocks noChangeAspect="1"/>
+            </wp:cNvGraphicFramePr>
+            <a:graphic>
+              <a:graphicData xmlns:a="http://schemas.openxmlformats.org/drawingml/2006/main" uri="http://schemas.openxmlformats.org/drawingml/2006/picture">
+                <pic:pic xmlns:pic="http://schemas.openxmlformats.org/drawingml/2006/picture">
+                  <pic:nvPicPr>
+                    <pic:cNvPr id="357675207" name="Picture 357675207"/>
+                    <pic:cNvPicPr/>
+                  </pic:nvPicPr>
+                  <pic:blipFill>
+                    <a:blip xmlns:r="http://schemas.openxmlformats.org/officeDocument/2006/relationships" r:embed="rId1891590301">
+                      <a:extLst>
+                        <a:ext uri="{28A0092B-C50C-407E-A947-70E740481C1C}">
+                          <a14:useLocalDpi xmlns:a14="http://schemas.microsoft.com/office/drawing/2010/main"/>
+                        </a:ext>
+                      </a:extLst>
+                    </a:blip>
+                    <a:stretch>
+                      <a:fillRect/>
+                    </a:stretch>
+                  </pic:blipFill>
+                  <pic:spPr>
+                    <a:xfrm>
+                      <a:off x="0" y="0"/>
+                      <a:ext cx="5943600" cy="3343275"/>
+                    </a:xfrm>
+                    <a:prstGeom prst="rect">
+                      <a:avLst/>
+                    </a:prstGeom>
+                  </pic:spPr>
+                </pic:pic>
+              </a:graphicData>
+            </a:graphic>
+            <wp14:sizeRelH relativeFrom="page">
+              <wp14:pctWidth>0</wp14:pctWidth>
+            </wp14:sizeRelH>
+            <wp14:sizeRelV relativeFrom="page">
+              <wp14:pctHeight>0</wp14:pctHeight>
+            </wp14:sizeRelV>
+          </wp:anchor>
+        </w:drawing>
+      </w:r>
+    </w:p>
+    <w:p xmlns:wp14="http://schemas.microsoft.com/office/word/2010/wordml" wp14:textId="77777777">
+      <w:pPr>
         <w:pStyle w:val="684"/>
-        <w:keepNext w:val="false"/>
-        <w:keepLines w:val="false"/>
-        <w:pBdr/>
-        <w:spacing w:after="40" w:before="0"/>
+        <w:keepNext w:val="0"/>
+        <w:keepLines w:val="0"/>
+        <w:spacing w:before="0" w:after="40"/>
         <w:ind w:firstLine="0"/>
         <w:jc w:val="both"/>
         <w:rPr>
-          <w:b/>
-          <w:bCs/>
+          <w:b w:val="1"/>
+          <w:bCs w:val="1"/>
           <w:color w:val="000000"/>
           <w:sz w:val="22"/>
           <w:szCs w:val="22"/>
+          <w:lang w:val="en-US"/>
         </w:rPr>
       </w:pPr>
-      <w:r/>
-      <w:bookmarkStart w:id="2" w:name="_tqhz5wd6l61j"/>
-      <w:r/>
+      <w:bookmarkStart w:name="_tqhz5wd6l61j" w:id="2"/>
       <w:bookmarkEnd w:id="2"/>
       <w:r>
         <w:rPr>
-          <w:b/>
-          <w:bCs/>
+          <w:b w:val="1"/>
+          <w:bCs w:val="1"/>
           <w:color w:val="000000"/>
           <w:sz w:val="22"/>
           <w:szCs w:val="22"/>
-          <w:rtl w:val="0"/>
+          <w:lang w:val="en-US"/>
         </w:rPr>
         <w:t xml:space="preserve">Conclusão:</w:t>
       </w:r>
@@ -2026,49 +2241,47 @@
         </w:rPr>
       </w:r>
     </w:p>
-    <w:p>
-      <w:pPr>
-        <w:pBdr/>
+    <w:p xmlns:wp14="http://schemas.microsoft.com/office/word/2010/wordml" wp14:textId="77777777">
+      <w:pPr>
         <w:spacing w:after="240"/>
         <w:ind w:firstLine="720"/>
         <w:jc w:val="both"/>
-        <w:rPr/>
       </w:pPr>
       <w:r>
         <w:rPr>
-          <w:rtl w:val="0"/>
+          <w:lang w:val="en-US"/>
         </w:rPr>
         <w:t xml:space="preserve">Em resumo, o levantamento de mercado deixa cl</w:t>
       </w:r>
       <w:r>
         <w:rPr>
-          <w:rtl w:val="0"/>
+          <w:lang w:val="en-US"/>
         </w:rPr>
         <w:t xml:space="preserve">aro que há uma oportunidade real a ser explorada. Enquanto as principais ferramentas focam em ecossistemas complexos, assinaturas caras e uso engessado no computador, nosso projeto se posiciona exatamente na contramão dessas dores. Desenvolver uma solução </w:t>
       </w:r>
       <w:r>
         <w:rPr>
-          <w:i/>
-          <w:iCs/>
-          <w:rtl w:val="0"/>
+          <w:i w:val="1"/>
+          <w:iCs w:val="1"/>
+          <w:lang w:val="en-US"/>
         </w:rPr>
         <w:t xml:space="preserve">mobile-first</w:t>
       </w:r>
       <w:r>
         <w:rPr>
-          <w:rtl w:val="0"/>
+          <w:lang w:val="en-US"/>
         </w:rPr>
         <w:t xml:space="preserve"> (pensada primeiramente para o celular),</w:t>
       </w:r>
       <w:r>
         <w:rPr>
-          <w:rtl w:val="0"/>
+          <w:lang w:val="en-US"/>
         </w:rPr>
         <w:t xml:space="preserve"> de código aberto e sem custos não é apenas criar mais um aplicativo de reuniões, mas sim entregar uma resposta direta ao que falta hoje: facilidade, agilidade e foco em resultados reais, eliminando a burocracia e a frustração das ferramentas tradicionais.</w:t>
       </w:r>
       <w:r/>
     </w:p>
-    <w:p>
+    <w:p xmlns:wp14="http://schemas.microsoft.com/office/word/2010/wordml" wp14:textId="77777777">
       <w:pPr>
         <w:pBdr/>
         <w:spacing/>
@@ -2083,7 +2296,7 @@
       </w:r>
       <w:r/>
     </w:p>
-    <w:p>
+    <w:p xmlns:wp14="http://schemas.microsoft.com/office/word/2010/wordml" wp14:textId="77777777">
       <w:pPr>
         <w:pBdr/>
         <w:spacing/>
@@ -2101,10 +2314,10 @@
       <w:footnotePr/>
       <w:endnotePr/>
       <w:type w:val="nextPage"/>
-      <w:pgSz w:h="15840" w:orient="portrait" w:w="12240"/>
+      <w:pgSz w:w="12240" w:h="15840" w:orient="portrait"/>
       <w:pgMar w:top="1440" w:right="1440" w:bottom="1440" w:left="1440" w:header="720" w:footer="720" w:gutter="0"/>
       <w:pgNumType w:start="1"/>
-      <w:cols w:num="1" w:sep="0" w:space="1701" w:equalWidth="1"/>
+      <w:cols w:equalWidth="1" w:space="1701" w:num="1" w:sep="0"/>
     </w:sectPr>
   </w:body>
 </w:document>
@@ -2113,7 +2326,7 @@
 <file path=word/endnotes.xml><?xml version="1.0" encoding="utf-8"?>
 <w:endnotes xmlns:wpc="http://schemas.microsoft.com/office/word/2010/wordprocessingCanvas" xmlns:mc="http://schemas.openxmlformats.org/markup-compatibility/2006" xmlns:o="urn:schemas-microsoft-com:office:office" xmlns:r="http://schemas.openxmlformats.org/officeDocument/2006/relationships" xmlns:m="http://schemas.openxmlformats.org/officeDocument/2006/math" xmlns:v="urn:schemas-microsoft-com:vml" xmlns:wp14="http://schemas.microsoft.com/office/word/2010/wordprocessingDrawing" xmlns:wp="http://schemas.openxmlformats.org/drawingml/2006/wordprocessingDrawing" xmlns:w10="urn:schemas-microsoft-com:office:word" xmlns:w="http://schemas.openxmlformats.org/wordprocessingml/2006/main" xmlns:w14="http://schemas.microsoft.com/office/word/2010/wordml" xmlns:w15="http://schemas.microsoft.com/office/word/2012/wordml" xmlns:wpg="http://schemas.microsoft.com/office/word/2010/wordprocessingGroup" xmlns:wpi="http://schemas.microsoft.com/office/word/2010/wordprocessingInk" xmlns:wne="http://schemas.microsoft.com/office/word/2006/wordml" xmlns:a="http://schemas.openxmlformats.org/drawingml/2006/main" xmlns:wps="http://schemas.microsoft.com/office/word/2010/wordprocessingShape" mc:Ignorable="w14 w15 wp14">
   <w:endnote w:type="separator" w:id="-1">
-    <w:p>
+    <w:p xmlns:wp14="http://schemas.microsoft.com/office/word/2010/wordml" wp14:textId="77777777">
       <w:pPr>
         <w:pBdr/>
         <w:spacing w:after="0" w:line="240" w:lineRule="auto"/>
@@ -2128,7 +2341,7 @@
     </w:p>
   </w:endnote>
   <w:endnote w:type="continuationSeparator" w:id="0">
-    <w:p>
+    <w:p xmlns:wp14="http://schemas.microsoft.com/office/word/2010/wordml" wp14:textId="77777777">
       <w:pPr>
         <w:pBdr/>
         <w:spacing w:after="0" w:line="240" w:lineRule="auto"/>
@@ -2148,7 +2361,7 @@
 <file path=word/footnotes.xml><?xml version="1.0" encoding="utf-8"?>
 <w:footnotes xmlns:wpc="http://schemas.microsoft.com/office/word/2010/wordprocessingCanvas" xmlns:mc="http://schemas.openxmlformats.org/markup-compatibility/2006" xmlns:o="urn:schemas-microsoft-com:office:office" xmlns:r="http://schemas.openxmlformats.org/officeDocument/2006/relationships" xmlns:m="http://schemas.openxmlformats.org/officeDocument/2006/math" xmlns:v="urn:schemas-microsoft-com:vml" xmlns:wp14="http://schemas.microsoft.com/office/word/2010/wordprocessingDrawing" xmlns:wp="http://schemas.openxmlformats.org/drawingml/2006/wordprocessingDrawing" xmlns:w10="urn:schemas-microsoft-com:office:word" xmlns:w="http://schemas.openxmlformats.org/wordprocessingml/2006/main" xmlns:w14="http://schemas.microsoft.com/office/word/2010/wordml" xmlns:w15="http://schemas.microsoft.com/office/word/2012/wordml" xmlns:wpg="http://schemas.microsoft.com/office/word/2010/wordprocessingGroup" xmlns:wpi="http://schemas.microsoft.com/office/word/2010/wordprocessingInk" xmlns:wne="http://schemas.microsoft.com/office/word/2006/wordml" xmlns:a="http://schemas.openxmlformats.org/drawingml/2006/main" xmlns:wps="http://schemas.microsoft.com/office/word/2010/wordprocessingShape" mc:Ignorable="w14 w15 wp14">
   <w:footnote w:type="separator" w:id="-1">
-    <w:p>
+    <w:p xmlns:wp14="http://schemas.microsoft.com/office/word/2010/wordml" wp14:textId="77777777">
       <w:pPr>
         <w:pBdr/>
         <w:spacing w:after="0" w:line="240" w:lineRule="auto"/>
@@ -2163,7 +2376,7 @@
     </w:p>
   </w:footnote>
   <w:footnote w:type="continuationSeparator" w:id="0">
-    <w:p>
+    <w:p xmlns:wp14="http://schemas.microsoft.com/office/word/2010/wordml" wp14:textId="77777777">
       <w:pPr>
         <w:pBdr/>
         <w:spacing w:after="0" w:line="240" w:lineRule="auto"/>
@@ -2191,7 +2404,7 @@
       <w:pPr>
         <w:pBdr/>
         <w:spacing/>
-        <w:ind w:hanging="360" w:left="720"/>
+        <w:ind w:left="720" w:hanging="360"/>
       </w:pPr>
       <w:rPr>
         <w:rFonts w:ascii="Arial" w:hAnsi="Arial" w:eastAsia="Arial" w:cs="Arial"/>
@@ -2208,7 +2421,7 @@
       <w:pPr>
         <w:pBdr/>
         <w:spacing/>
-        <w:ind w:hanging="360" w:left="1440"/>
+        <w:ind w:left="1440" w:hanging="360"/>
       </w:pPr>
       <w:rPr>
         <w:rFonts w:ascii="Arial" w:hAnsi="Arial" w:eastAsia="Arial" w:cs="Arial"/>
@@ -2225,7 +2438,7 @@
       <w:pPr>
         <w:pBdr/>
         <w:spacing/>
-        <w:ind w:hanging="360" w:left="2160"/>
+        <w:ind w:left="2160" w:hanging="360"/>
       </w:pPr>
       <w:rPr>
         <w:u w:val="none"/>
@@ -2241,7 +2454,7 @@
       <w:pPr>
         <w:pBdr/>
         <w:spacing/>
-        <w:ind w:hanging="360" w:left="2880"/>
+        <w:ind w:left="2880" w:hanging="360"/>
       </w:pPr>
       <w:rPr>
         <w:u w:val="none"/>
@@ -2257,7 +2470,7 @@
       <w:pPr>
         <w:pBdr/>
         <w:spacing/>
-        <w:ind w:hanging="360" w:left="3600"/>
+        <w:ind w:left="3600" w:hanging="360"/>
       </w:pPr>
       <w:rPr>
         <w:u w:val="none"/>
@@ -2273,7 +2486,7 @@
       <w:pPr>
         <w:pBdr/>
         <w:spacing/>
-        <w:ind w:hanging="360" w:left="4320"/>
+        <w:ind w:left="4320" w:hanging="360"/>
       </w:pPr>
       <w:rPr>
         <w:u w:val="none"/>
@@ -2289,7 +2502,7 @@
       <w:pPr>
         <w:pBdr/>
         <w:spacing/>
-        <w:ind w:hanging="360" w:left="5040"/>
+        <w:ind w:left="5040" w:hanging="360"/>
       </w:pPr>
       <w:rPr>
         <w:u w:val="none"/>
@@ -2305,7 +2518,7 @@
       <w:pPr>
         <w:pBdr/>
         <w:spacing/>
-        <w:ind w:hanging="360" w:left="5760"/>
+        <w:ind w:left="5760" w:hanging="360"/>
       </w:pPr>
       <w:rPr>
         <w:u w:val="none"/>
@@ -2321,7 +2534,7 @@
       <w:pPr>
         <w:pBdr/>
         <w:spacing/>
-        <w:ind w:hanging="360" w:left="6480"/>
+        <w:ind w:left="6480" w:hanging="360"/>
       </w:pPr>
       <w:rPr>
         <w:u w:val="none"/>
@@ -2329,6 +2542,7 @@
       <w:start w:val="1"/>
       <w:suff w:val="tab"/>
     </w:lvl>
+    <w:nsid w:val="5ecd6d40"/>
   </w:abstractNum>
   <w:abstractNum w:abstractNumId="1">
     <w:lvl w:ilvl="0">
@@ -2339,7 +2553,7 @@
       <w:pPr>
         <w:pBdr/>
         <w:spacing/>
-        <w:ind w:hanging="360" w:left="720"/>
+        <w:ind w:left="720" w:hanging="360"/>
       </w:pPr>
       <w:rPr>
         <w:rFonts w:ascii="Arial" w:hAnsi="Arial" w:eastAsia="Arial" w:cs="Arial"/>
@@ -2356,7 +2570,7 @@
       <w:pPr>
         <w:pBdr/>
         <w:spacing/>
-        <w:ind w:hanging="360" w:left="1440"/>
+        <w:ind w:left="1440" w:hanging="360"/>
       </w:pPr>
       <w:rPr>
         <w:rFonts w:ascii="Arial" w:hAnsi="Arial" w:eastAsia="Arial" w:cs="Arial"/>
@@ -2373,7 +2587,7 @@
       <w:pPr>
         <w:pBdr/>
         <w:spacing/>
-        <w:ind w:hanging="360" w:left="2160"/>
+        <w:ind w:left="2160" w:hanging="360"/>
       </w:pPr>
       <w:rPr>
         <w:u w:val="none"/>
@@ -2389,7 +2603,7 @@
       <w:pPr>
         <w:pBdr/>
         <w:spacing/>
-        <w:ind w:hanging="360" w:left="2880"/>
+        <w:ind w:left="2880" w:hanging="360"/>
       </w:pPr>
       <w:rPr>
         <w:u w:val="none"/>
@@ -2405,7 +2619,7 @@
       <w:pPr>
         <w:pBdr/>
         <w:spacing/>
-        <w:ind w:hanging="360" w:left="3600"/>
+        <w:ind w:left="3600" w:hanging="360"/>
       </w:pPr>
       <w:rPr>
         <w:u w:val="none"/>
@@ -2421,7 +2635,7 @@
       <w:pPr>
         <w:pBdr/>
         <w:spacing/>
-        <w:ind w:hanging="360" w:left="4320"/>
+        <w:ind w:left="4320" w:hanging="360"/>
       </w:pPr>
       <w:rPr>
         <w:u w:val="none"/>
@@ -2437,7 +2651,7 @@
       <w:pPr>
         <w:pBdr/>
         <w:spacing/>
-        <w:ind w:hanging="360" w:left="5040"/>
+        <w:ind w:left="5040" w:hanging="360"/>
       </w:pPr>
       <w:rPr>
         <w:u w:val="none"/>
@@ -2453,7 +2667,7 @@
       <w:pPr>
         <w:pBdr/>
         <w:spacing/>
-        <w:ind w:hanging="360" w:left="5760"/>
+        <w:ind w:left="5760" w:hanging="360"/>
       </w:pPr>
       <w:rPr>
         <w:u w:val="none"/>
@@ -2469,7 +2683,7 @@
       <w:pPr>
         <w:pBdr/>
         <w:spacing/>
-        <w:ind w:hanging="360" w:left="6480"/>
+        <w:ind w:left="6480" w:hanging="360"/>
       </w:pPr>
       <w:rPr>
         <w:u w:val="none"/>
@@ -2477,6 +2691,7 @@
       <w:start w:val="1"/>
       <w:suff w:val="tab"/>
     </w:lvl>
+    <w:nsid w:val="a9f02f8"/>
   </w:abstractNum>
   <w:abstractNum w:abstractNumId="2">
     <w:lvl w:ilvl="0">
@@ -2487,7 +2702,7 @@
       <w:pPr>
         <w:pBdr/>
         <w:spacing/>
-        <w:ind w:hanging="360" w:left="720"/>
+        <w:ind w:left="720" w:hanging="360"/>
       </w:pPr>
       <w:rPr>
         <w:rFonts w:ascii="Arial" w:hAnsi="Arial" w:eastAsia="Arial" w:cs="Arial"/>
@@ -2504,7 +2719,7 @@
       <w:pPr>
         <w:pBdr/>
         <w:spacing/>
-        <w:ind w:hanging="360" w:left="1440"/>
+        <w:ind w:left="1440" w:hanging="360"/>
       </w:pPr>
       <w:rPr>
         <w:rFonts w:ascii="Arial" w:hAnsi="Arial" w:eastAsia="Arial" w:cs="Arial"/>
@@ -2521,7 +2736,7 @@
       <w:pPr>
         <w:pBdr/>
         <w:spacing/>
-        <w:ind w:hanging="360" w:left="2160"/>
+        <w:ind w:left="2160" w:hanging="360"/>
       </w:pPr>
       <w:rPr>
         <w:u w:val="none"/>
@@ -2537,7 +2752,7 @@
       <w:pPr>
         <w:pBdr/>
         <w:spacing/>
-        <w:ind w:hanging="360" w:left="2880"/>
+        <w:ind w:left="2880" w:hanging="360"/>
       </w:pPr>
       <w:rPr>
         <w:u w:val="none"/>
@@ -2553,7 +2768,7 @@
       <w:pPr>
         <w:pBdr/>
         <w:spacing/>
-        <w:ind w:hanging="360" w:left="3600"/>
+        <w:ind w:left="3600" w:hanging="360"/>
       </w:pPr>
       <w:rPr>
         <w:u w:val="none"/>
@@ -2569,7 +2784,7 @@
       <w:pPr>
         <w:pBdr/>
         <w:spacing/>
-        <w:ind w:hanging="360" w:left="4320"/>
+        <w:ind w:left="4320" w:hanging="360"/>
       </w:pPr>
       <w:rPr>
         <w:u w:val="none"/>
@@ -2585,7 +2800,7 @@
       <w:pPr>
         <w:pBdr/>
         <w:spacing/>
-        <w:ind w:hanging="360" w:left="5040"/>
+        <w:ind w:left="5040" w:hanging="360"/>
       </w:pPr>
       <w:rPr>
         <w:u w:val="none"/>
@@ -2601,7 +2816,7 @@
       <w:pPr>
         <w:pBdr/>
         <w:spacing/>
-        <w:ind w:hanging="360" w:left="5760"/>
+        <w:ind w:left="5760" w:hanging="360"/>
       </w:pPr>
       <w:rPr>
         <w:u w:val="none"/>
@@ -2617,7 +2832,7 @@
       <w:pPr>
         <w:pBdr/>
         <w:spacing/>
-        <w:ind w:hanging="360" w:left="6480"/>
+        <w:ind w:left="6480" w:hanging="360"/>
       </w:pPr>
       <w:rPr>
         <w:u w:val="none"/>
@@ -2625,6 +2840,7 @@
       <w:start w:val="1"/>
       <w:suff w:val="tab"/>
     </w:lvl>
+    <w:nsid w:val="5f148f4f"/>
   </w:abstractNum>
   <w:abstractNum w:abstractNumId="3">
     <w:lvl w:ilvl="0">
@@ -2635,7 +2851,7 @@
       <w:pPr>
         <w:pBdr/>
         <w:spacing/>
-        <w:ind w:hanging="360" w:left="720"/>
+        <w:ind w:left="720" w:hanging="360"/>
       </w:pPr>
       <w:rPr>
         <w:rFonts w:ascii="Arial" w:hAnsi="Arial" w:eastAsia="Arial" w:cs="Arial"/>
@@ -2652,7 +2868,7 @@
       <w:pPr>
         <w:pBdr/>
         <w:spacing/>
-        <w:ind w:hanging="360" w:left="1440"/>
+        <w:ind w:left="1440" w:hanging="360"/>
       </w:pPr>
       <w:rPr>
         <w:rFonts w:ascii="Arial" w:hAnsi="Arial" w:eastAsia="Arial" w:cs="Arial"/>
@@ -2669,7 +2885,7 @@
       <w:pPr>
         <w:pBdr/>
         <w:spacing/>
-        <w:ind w:hanging="360" w:left="2160"/>
+        <w:ind w:left="2160" w:hanging="360"/>
       </w:pPr>
       <w:rPr>
         <w:u w:val="none"/>
@@ -2685,7 +2901,7 @@
       <w:pPr>
         <w:pBdr/>
         <w:spacing/>
-        <w:ind w:hanging="360" w:left="2880"/>
+        <w:ind w:left="2880" w:hanging="360"/>
       </w:pPr>
       <w:rPr>
         <w:u w:val="none"/>
@@ -2701,7 +2917,7 @@
       <w:pPr>
         <w:pBdr/>
         <w:spacing/>
-        <w:ind w:hanging="360" w:left="3600"/>
+        <w:ind w:left="3600" w:hanging="360"/>
       </w:pPr>
       <w:rPr>
         <w:u w:val="none"/>
@@ -2717,7 +2933,7 @@
       <w:pPr>
         <w:pBdr/>
         <w:spacing/>
-        <w:ind w:hanging="360" w:left="4320"/>
+        <w:ind w:left="4320" w:hanging="360"/>
       </w:pPr>
       <w:rPr>
         <w:u w:val="none"/>
@@ -2733,7 +2949,7 @@
       <w:pPr>
         <w:pBdr/>
         <w:spacing/>
-        <w:ind w:hanging="360" w:left="5040"/>
+        <w:ind w:left="5040" w:hanging="360"/>
       </w:pPr>
       <w:rPr>
         <w:u w:val="none"/>
@@ -2749,7 +2965,7 @@
       <w:pPr>
         <w:pBdr/>
         <w:spacing/>
-        <w:ind w:hanging="360" w:left="5760"/>
+        <w:ind w:left="5760" w:hanging="360"/>
       </w:pPr>
       <w:rPr>
         <w:u w:val="none"/>
@@ -2765,7 +2981,7 @@
       <w:pPr>
         <w:pBdr/>
         <w:spacing/>
-        <w:ind w:hanging="360" w:left="6480"/>
+        <w:ind w:left="6480" w:hanging="360"/>
       </w:pPr>
       <w:rPr>
         <w:u w:val="none"/>
@@ -2773,6 +2989,7 @@
       <w:start w:val="1"/>
       <w:suff w:val="tab"/>
     </w:lvl>
+    <w:nsid w:val="7017eef0"/>
   </w:abstractNum>
   <w:abstractNum w:abstractNumId="4">
     <w:lvl w:ilvl="0">
@@ -2783,7 +3000,7 @@
       <w:pPr>
         <w:pBdr/>
         <w:spacing/>
-        <w:ind w:hanging="360" w:left="720"/>
+        <w:ind w:left="720" w:hanging="360"/>
       </w:pPr>
       <w:rPr>
         <w:rFonts w:ascii="Arial" w:hAnsi="Arial" w:eastAsia="Arial" w:cs="Arial"/>
@@ -2800,7 +3017,7 @@
       <w:pPr>
         <w:pBdr/>
         <w:spacing/>
-        <w:ind w:hanging="360" w:left="1440"/>
+        <w:ind w:left="1440" w:hanging="360"/>
       </w:pPr>
       <w:rPr>
         <w:rFonts w:ascii="Arial" w:hAnsi="Arial" w:eastAsia="Arial" w:cs="Arial"/>
@@ -2817,7 +3034,7 @@
       <w:pPr>
         <w:pBdr/>
         <w:spacing/>
-        <w:ind w:hanging="360" w:left="2160"/>
+        <w:ind w:left="2160" w:hanging="360"/>
       </w:pPr>
       <w:rPr>
         <w:u w:val="none"/>
@@ -2833,7 +3050,7 @@
       <w:pPr>
         <w:pBdr/>
         <w:spacing/>
-        <w:ind w:hanging="360" w:left="2880"/>
+        <w:ind w:left="2880" w:hanging="360"/>
       </w:pPr>
       <w:rPr>
         <w:u w:val="none"/>
@@ -2849,7 +3066,7 @@
       <w:pPr>
         <w:pBdr/>
         <w:spacing/>
-        <w:ind w:hanging="360" w:left="3600"/>
+        <w:ind w:left="3600" w:hanging="360"/>
       </w:pPr>
       <w:rPr>
         <w:u w:val="none"/>
@@ -2865,7 +3082,7 @@
       <w:pPr>
         <w:pBdr/>
         <w:spacing/>
-        <w:ind w:hanging="360" w:left="4320"/>
+        <w:ind w:left="4320" w:hanging="360"/>
       </w:pPr>
       <w:rPr>
         <w:u w:val="none"/>
@@ -2881,7 +3098,7 @@
       <w:pPr>
         <w:pBdr/>
         <w:spacing/>
-        <w:ind w:hanging="360" w:left="5040"/>
+        <w:ind w:left="5040" w:hanging="360"/>
       </w:pPr>
       <w:rPr>
         <w:u w:val="none"/>
@@ -2897,7 +3114,7 @@
       <w:pPr>
         <w:pBdr/>
         <w:spacing/>
-        <w:ind w:hanging="360" w:left="5760"/>
+        <w:ind w:left="5760" w:hanging="360"/>
       </w:pPr>
       <w:rPr>
         <w:u w:val="none"/>
@@ -2913,7 +3130,7 @@
       <w:pPr>
         <w:pBdr/>
         <w:spacing/>
-        <w:ind w:hanging="360" w:left="6480"/>
+        <w:ind w:left="6480" w:hanging="360"/>
       </w:pPr>
       <w:rPr>
         <w:u w:val="none"/>
@@ -2921,6 +3138,7 @@
       <w:start w:val="1"/>
       <w:suff w:val="tab"/>
     </w:lvl>
+    <w:nsid w:val="b88a1de"/>
   </w:abstractNum>
   <w:abstractNum w:abstractNumId="5">
     <w:lvl w:ilvl="0">
@@ -2931,7 +3149,7 @@
       <w:pPr>
         <w:pBdr/>
         <w:spacing/>
-        <w:ind w:hanging="360" w:left="720"/>
+        <w:ind w:left="720" w:hanging="360"/>
       </w:pPr>
       <w:rPr>
         <w:rFonts w:ascii="Arial" w:hAnsi="Arial" w:eastAsia="Arial" w:cs="Arial"/>
@@ -2948,7 +3166,7 @@
       <w:pPr>
         <w:pBdr/>
         <w:spacing/>
-        <w:ind w:hanging="360" w:left="1440"/>
+        <w:ind w:left="1440" w:hanging="360"/>
       </w:pPr>
       <w:rPr>
         <w:rFonts w:ascii="Arial" w:hAnsi="Arial" w:eastAsia="Arial" w:cs="Arial"/>
@@ -2965,7 +3183,7 @@
       <w:pPr>
         <w:pBdr/>
         <w:spacing/>
-        <w:ind w:hanging="360" w:left="2160"/>
+        <w:ind w:left="2160" w:hanging="360"/>
       </w:pPr>
       <w:rPr>
         <w:u w:val="none"/>
@@ -2981,7 +3199,7 @@
       <w:pPr>
         <w:pBdr/>
         <w:spacing/>
-        <w:ind w:hanging="360" w:left="2880"/>
+        <w:ind w:left="2880" w:hanging="360"/>
       </w:pPr>
       <w:rPr>
         <w:u w:val="none"/>
@@ -2997,7 +3215,7 @@
       <w:pPr>
         <w:pBdr/>
         <w:spacing/>
-        <w:ind w:hanging="360" w:left="3600"/>
+        <w:ind w:left="3600" w:hanging="360"/>
       </w:pPr>
       <w:rPr>
         <w:u w:val="none"/>
@@ -3013,7 +3231,7 @@
       <w:pPr>
         <w:pBdr/>
         <w:spacing/>
-        <w:ind w:hanging="360" w:left="4320"/>
+        <w:ind w:left="4320" w:hanging="360"/>
       </w:pPr>
       <w:rPr>
         <w:u w:val="none"/>
@@ -3029,7 +3247,7 @@
       <w:pPr>
         <w:pBdr/>
         <w:spacing/>
-        <w:ind w:hanging="360" w:left="5040"/>
+        <w:ind w:left="5040" w:hanging="360"/>
       </w:pPr>
       <w:rPr>
         <w:u w:val="none"/>
@@ -3045,7 +3263,7 @@
       <w:pPr>
         <w:pBdr/>
         <w:spacing/>
-        <w:ind w:hanging="360" w:left="5760"/>
+        <w:ind w:left="5760" w:hanging="360"/>
       </w:pPr>
       <w:rPr>
         <w:u w:val="none"/>
@@ -3061,7 +3279,7 @@
       <w:pPr>
         <w:pBdr/>
         <w:spacing/>
-        <w:ind w:hanging="360" w:left="6480"/>
+        <w:ind w:left="6480" w:hanging="360"/>
       </w:pPr>
       <w:rPr>
         <w:u w:val="none"/>
@@ -3069,6 +3287,7 @@
       <w:start w:val="1"/>
       <w:suff w:val="tab"/>
     </w:lvl>
+    <w:nsid w:val="4aae721f"/>
   </w:abstractNum>
   <w:abstractNum w:abstractNumId="6">
     <w:lvl w:ilvl="0">
@@ -3079,7 +3298,7 @@
       <w:pPr>
         <w:pBdr/>
         <w:spacing/>
-        <w:ind w:hanging="360" w:left="720"/>
+        <w:ind w:left="720" w:hanging="360"/>
       </w:pPr>
       <w:rPr>
         <w:rFonts w:ascii="Arial" w:hAnsi="Arial" w:eastAsia="Arial" w:cs="Arial"/>
@@ -3096,7 +3315,7 @@
       <w:pPr>
         <w:pBdr/>
         <w:spacing/>
-        <w:ind w:hanging="360" w:left="1440"/>
+        <w:ind w:left="1440" w:hanging="360"/>
       </w:pPr>
       <w:rPr>
         <w:rFonts w:ascii="Arial" w:hAnsi="Arial" w:eastAsia="Arial" w:cs="Arial"/>
@@ -3113,7 +3332,7 @@
       <w:pPr>
         <w:pBdr/>
         <w:spacing/>
-        <w:ind w:hanging="360" w:left="2160"/>
+        <w:ind w:left="2160" w:hanging="360"/>
       </w:pPr>
       <w:rPr>
         <w:u w:val="none"/>
@@ -3129,7 +3348,7 @@
       <w:pPr>
         <w:pBdr/>
         <w:spacing/>
-        <w:ind w:hanging="360" w:left="2880"/>
+        <w:ind w:left="2880" w:hanging="360"/>
       </w:pPr>
       <w:rPr>
         <w:u w:val="none"/>
@@ -3145,7 +3364,7 @@
       <w:pPr>
         <w:pBdr/>
         <w:spacing/>
-        <w:ind w:hanging="360" w:left="3600"/>
+        <w:ind w:left="3600" w:hanging="360"/>
       </w:pPr>
       <w:rPr>
         <w:u w:val="none"/>
@@ -3161,7 +3380,7 @@
       <w:pPr>
         <w:pBdr/>
         <w:spacing/>
-        <w:ind w:hanging="360" w:left="4320"/>
+        <w:ind w:left="4320" w:hanging="360"/>
       </w:pPr>
       <w:rPr>
         <w:u w:val="none"/>
@@ -3177,7 +3396,7 @@
       <w:pPr>
         <w:pBdr/>
         <w:spacing/>
-        <w:ind w:hanging="360" w:left="5040"/>
+        <w:ind w:left="5040" w:hanging="360"/>
       </w:pPr>
       <w:rPr>
         <w:u w:val="none"/>
@@ -3193,7 +3412,7 @@
       <w:pPr>
         <w:pBdr/>
         <w:spacing/>
-        <w:ind w:hanging="360" w:left="5760"/>
+        <w:ind w:left="5760" w:hanging="360"/>
       </w:pPr>
       <w:rPr>
         <w:u w:val="none"/>
@@ -3209,7 +3428,7 @@
       <w:pPr>
         <w:pBdr/>
         <w:spacing/>
-        <w:ind w:hanging="360" w:left="6480"/>
+        <w:ind w:left="6480" w:hanging="360"/>
       </w:pPr>
       <w:rPr>
         <w:u w:val="none"/>
@@ -3217,6 +3436,7 @@
       <w:start w:val="1"/>
       <w:suff w:val="tab"/>
     </w:lvl>
+    <w:nsid w:val="240ef460"/>
   </w:abstractNum>
   <w:num w:numId="1">
     <w:abstractNumId w:val="0"/>
@@ -3243,7 +3463,7 @@
 </file>
 
 <file path=word/styles.xml><?xml version="1.0" encoding="utf-8"?>
-<w:styles xmlns:mc="http://schemas.openxmlformats.org/markup-compatibility/2006" xmlns:r="http://schemas.openxmlformats.org/officeDocument/2006/relationships" xmlns:w="http://schemas.openxmlformats.org/wordprocessingml/2006/main" xmlns:w14="http://schemas.microsoft.com/office/word/2010/wordml" xmlns:w15="http://schemas.microsoft.com/office/word/2012/wordml" mc:Ignorable="w14 w15">
+<w:styles xmlns:wp14="http://schemas.microsoft.com/office/word/2010/wordprocessingDrawing" xmlns:mc="http://schemas.openxmlformats.org/markup-compatibility/2006" xmlns:r="http://schemas.openxmlformats.org/officeDocument/2006/relationships" xmlns:w="http://schemas.openxmlformats.org/wordprocessingml/2006/main" xmlns:w14="http://schemas.microsoft.com/office/word/2010/wordml" xmlns:w15="http://schemas.microsoft.com/office/word/2012/wordml" mc:Ignorable="w14 w15 wp14">
   <w:docDefaults>
     <w:rPrDefault>
       <w:rPr>
@@ -3255,14 +3475,14 @@
     <w:pPrDefault>
       <w:pPr>
         <w:pBdr/>
-        <w:spacing w:after="0" w:afterAutospacing="0" w:before="0" w:beforeAutospacing="0" w:line="276" w:lineRule="auto"/>
+        <w:spacing w:before="0" w:beforeAutospacing="0" w:after="0" w:afterAutospacing="0" w:line="276" w:lineRule="auto"/>
         <w:ind/>
       </w:pPr>
     </w:pPrDefault>
   </w:docDefaults>
   <w:latentStyles w:defLockedState="0" w:defUIPriority="99" w:defSemiHidden="1" w:defUnhideWhenUsed="1" w:defQFormat="0" w:count="267">
-    <w:lsdException w:name="Normal" w:semiHidden="0" w:uiPriority="0" w:unhideWhenUsed="0" w:qFormat="1"/>
-    <w:lsdException w:name="heading 1" w:semiHidden="0" w:uiPriority="9" w:unhideWhenUsed="0" w:qFormat="1"/>
+    <w:lsdException w:name="Normal" w:uiPriority="0" w:semiHidden="0" w:unhideWhenUsed="0" w:qFormat="1"/>
+    <w:lsdException w:name="heading 1" w:uiPriority="9" w:semiHidden="0" w:unhideWhenUsed="0" w:qFormat="1"/>
     <w:lsdException w:name="heading 2" w:uiPriority="9" w:qFormat="1"/>
     <w:lsdException w:name="heading 3" w:uiPriority="9" w:qFormat="1"/>
     <w:lsdException w:name="heading 4" w:uiPriority="9" w:qFormat="1"/>
@@ -3281,121 +3501,121 @@
     <w:lsdException w:name="toc 8" w:uiPriority="39"/>
     <w:lsdException w:name="toc 9" w:uiPriority="39"/>
     <w:lsdException w:name="caption" w:uiPriority="35" w:qFormat="1"/>
-    <w:lsdException w:name="Title" w:semiHidden="0" w:uiPriority="10" w:unhideWhenUsed="0" w:qFormat="1"/>
+    <w:lsdException w:name="Title" w:uiPriority="10" w:semiHidden="0" w:unhideWhenUsed="0" w:qFormat="1"/>
     <w:lsdException w:name="Default Paragraph Font" w:uiPriority="1"/>
-    <w:lsdException w:name="Subtitle" w:semiHidden="0" w:uiPriority="11" w:unhideWhenUsed="0" w:qFormat="1"/>
-    <w:lsdException w:name="Strong" w:semiHidden="0" w:uiPriority="22" w:unhideWhenUsed="0" w:qFormat="1"/>
-    <w:lsdException w:name="Emphasis" w:semiHidden="0" w:uiPriority="20" w:unhideWhenUsed="0" w:qFormat="1"/>
-    <w:lsdException w:name="Table Grid" w:semiHidden="0" w:uiPriority="59" w:unhideWhenUsed="0"/>
+    <w:lsdException w:name="Subtitle" w:uiPriority="11" w:semiHidden="0" w:unhideWhenUsed="0" w:qFormat="1"/>
+    <w:lsdException w:name="Strong" w:uiPriority="22" w:semiHidden="0" w:unhideWhenUsed="0" w:qFormat="1"/>
+    <w:lsdException w:name="Emphasis" w:uiPriority="20" w:semiHidden="0" w:unhideWhenUsed="0" w:qFormat="1"/>
+    <w:lsdException w:name="Table Grid" w:uiPriority="59" w:semiHidden="0" w:unhideWhenUsed="0"/>
     <w:lsdException w:name="Placeholder Text" w:unhideWhenUsed="0"/>
-    <w:lsdException w:name="No Spacing" w:semiHidden="0" w:uiPriority="1" w:unhideWhenUsed="0" w:qFormat="1"/>
-    <w:lsdException w:name="Light Shading" w:semiHidden="0" w:uiPriority="60" w:unhideWhenUsed="0"/>
-    <w:lsdException w:name="Light List" w:semiHidden="0" w:uiPriority="61" w:unhideWhenUsed="0"/>
-    <w:lsdException w:name="Light Grid" w:semiHidden="0" w:uiPriority="62" w:unhideWhenUsed="0"/>
-    <w:lsdException w:name="Medium Shading 1" w:semiHidden="0" w:uiPriority="63" w:unhideWhenUsed="0"/>
-    <w:lsdException w:name="Medium Shading 2" w:semiHidden="0" w:uiPriority="64" w:unhideWhenUsed="0"/>
-    <w:lsdException w:name="Medium List 1" w:semiHidden="0" w:uiPriority="65" w:unhideWhenUsed="0"/>
-    <w:lsdException w:name="Medium List 2" w:semiHidden="0" w:uiPriority="66" w:unhideWhenUsed="0"/>
-    <w:lsdException w:name="Medium Grid 1" w:semiHidden="0" w:uiPriority="67" w:unhideWhenUsed="0"/>
-    <w:lsdException w:name="Medium Grid 2" w:semiHidden="0" w:uiPriority="68" w:unhideWhenUsed="0"/>
-    <w:lsdException w:name="Medium Grid 3" w:semiHidden="0" w:uiPriority="69" w:unhideWhenUsed="0"/>
-    <w:lsdException w:name="Dark List" w:semiHidden="0" w:uiPriority="70" w:unhideWhenUsed="0"/>
-    <w:lsdException w:name="Colorful Shading" w:semiHidden="0" w:uiPriority="71" w:unhideWhenUsed="0"/>
-    <w:lsdException w:name="Colorful List" w:semiHidden="0" w:uiPriority="72" w:unhideWhenUsed="0"/>
-    <w:lsdException w:name="Colorful Grid" w:semiHidden="0" w:uiPriority="73" w:unhideWhenUsed="0"/>
-    <w:lsdException w:name="Light Shading Accent 1" w:semiHidden="0" w:uiPriority="60" w:unhideWhenUsed="0"/>
-    <w:lsdException w:name="Light List Accent 1" w:semiHidden="0" w:uiPriority="61" w:unhideWhenUsed="0"/>
-    <w:lsdException w:name="Light Grid Accent 1" w:semiHidden="0" w:uiPriority="62" w:unhideWhenUsed="0"/>
-    <w:lsdException w:name="Medium Shading 1 Accent 1" w:semiHidden="0" w:uiPriority="63" w:unhideWhenUsed="0"/>
-    <w:lsdException w:name="Medium Shading 2 Accent 1" w:semiHidden="0" w:uiPriority="64" w:unhideWhenUsed="0"/>
-    <w:lsdException w:name="Medium List 1 Accent 1" w:semiHidden="0" w:uiPriority="65" w:unhideWhenUsed="0"/>
+    <w:lsdException w:name="No Spacing" w:uiPriority="1" w:semiHidden="0" w:unhideWhenUsed="0" w:qFormat="1"/>
+    <w:lsdException w:name="Light Shading" w:uiPriority="60" w:semiHidden="0" w:unhideWhenUsed="0"/>
+    <w:lsdException w:name="Light List" w:uiPriority="61" w:semiHidden="0" w:unhideWhenUsed="0"/>
+    <w:lsdException w:name="Light Grid" w:uiPriority="62" w:semiHidden="0" w:unhideWhenUsed="0"/>
+    <w:lsdException w:name="Medium Shading 1" w:uiPriority="63" w:semiHidden="0" w:unhideWhenUsed="0"/>
+    <w:lsdException w:name="Medium Shading 2" w:uiPriority="64" w:semiHidden="0" w:unhideWhenUsed="0"/>
+    <w:lsdException w:name="Medium List 1" w:uiPriority="65" w:semiHidden="0" w:unhideWhenUsed="0"/>
+    <w:lsdException w:name="Medium List 2" w:uiPriority="66" w:semiHidden="0" w:unhideWhenUsed="0"/>
+    <w:lsdException w:name="Medium Grid 1" w:uiPriority="67" w:semiHidden="0" w:unhideWhenUsed="0"/>
+    <w:lsdException w:name="Medium Grid 2" w:uiPriority="68" w:semiHidden="0" w:unhideWhenUsed="0"/>
+    <w:lsdException w:name="Medium Grid 3" w:uiPriority="69" w:semiHidden="0" w:unhideWhenUsed="0"/>
+    <w:lsdException w:name="Dark List" w:uiPriority="70" w:semiHidden="0" w:unhideWhenUsed="0"/>
+    <w:lsdException w:name="Colorful Shading" w:uiPriority="71" w:semiHidden="0" w:unhideWhenUsed="0"/>
+    <w:lsdException w:name="Colorful List" w:uiPriority="72" w:semiHidden="0" w:unhideWhenUsed="0"/>
+    <w:lsdException w:name="Colorful Grid" w:uiPriority="73" w:semiHidden="0" w:unhideWhenUsed="0"/>
+    <w:lsdException w:name="Light Shading Accent 1" w:uiPriority="60" w:semiHidden="0" w:unhideWhenUsed="0"/>
+    <w:lsdException w:name="Light List Accent 1" w:uiPriority="61" w:semiHidden="0" w:unhideWhenUsed="0"/>
+    <w:lsdException w:name="Light Grid Accent 1" w:uiPriority="62" w:semiHidden="0" w:unhideWhenUsed="0"/>
+    <w:lsdException w:name="Medium Shading 1 Accent 1" w:uiPriority="63" w:semiHidden="0" w:unhideWhenUsed="0"/>
+    <w:lsdException w:name="Medium Shading 2 Accent 1" w:uiPriority="64" w:semiHidden="0" w:unhideWhenUsed="0"/>
+    <w:lsdException w:name="Medium List 1 Accent 1" w:uiPriority="65" w:semiHidden="0" w:unhideWhenUsed="0"/>
     <w:lsdException w:name="Revision" w:unhideWhenUsed="0"/>
-    <w:lsdException w:name="List Paragraph" w:semiHidden="0" w:uiPriority="34" w:unhideWhenUsed="0" w:qFormat="1"/>
-    <w:lsdException w:name="Quote" w:semiHidden="0" w:uiPriority="29" w:unhideWhenUsed="0" w:qFormat="1"/>
-    <w:lsdException w:name="Intense Quote" w:semiHidden="0" w:uiPriority="30" w:unhideWhenUsed="0" w:qFormat="1"/>
-    <w:lsdException w:name="Medium List 2 Accent 1" w:semiHidden="0" w:uiPriority="66" w:unhideWhenUsed="0"/>
-    <w:lsdException w:name="Medium Grid 1 Accent 1" w:semiHidden="0" w:uiPriority="67" w:unhideWhenUsed="0"/>
-    <w:lsdException w:name="Medium Grid 2 Accent 1" w:semiHidden="0" w:uiPriority="68" w:unhideWhenUsed="0"/>
-    <w:lsdException w:name="Medium Grid 3 Accent 1" w:semiHidden="0" w:uiPriority="69" w:unhideWhenUsed="0"/>
-    <w:lsdException w:name="Dark List Accent 1" w:semiHidden="0" w:uiPriority="70" w:unhideWhenUsed="0"/>
-    <w:lsdException w:name="Colorful Shading Accent 1" w:semiHidden="0" w:uiPriority="71" w:unhideWhenUsed="0"/>
-    <w:lsdException w:name="Colorful List Accent 1" w:semiHidden="0" w:uiPriority="72" w:unhideWhenUsed="0"/>
-    <w:lsdException w:name="Colorful Grid Accent 1" w:semiHidden="0" w:uiPriority="73" w:unhideWhenUsed="0"/>
-    <w:lsdException w:name="Light Shading Accent 2" w:semiHidden="0" w:uiPriority="60" w:unhideWhenUsed="0"/>
-    <w:lsdException w:name="Light List Accent 2" w:semiHidden="0" w:uiPriority="61" w:unhideWhenUsed="0"/>
-    <w:lsdException w:name="Light Grid Accent 2" w:semiHidden="0" w:uiPriority="62" w:unhideWhenUsed="0"/>
-    <w:lsdException w:name="Medium Shading 1 Accent 2" w:semiHidden="0" w:uiPriority="63" w:unhideWhenUsed="0"/>
-    <w:lsdException w:name="Medium Shading 2 Accent 2" w:semiHidden="0" w:uiPriority="64" w:unhideWhenUsed="0"/>
-    <w:lsdException w:name="Medium List 1 Accent 2" w:semiHidden="0" w:uiPriority="65" w:unhideWhenUsed="0"/>
-    <w:lsdException w:name="Medium List 2 Accent 2" w:semiHidden="0" w:uiPriority="66" w:unhideWhenUsed="0"/>
-    <w:lsdException w:name="Medium Grid 1 Accent 2" w:semiHidden="0" w:uiPriority="67" w:unhideWhenUsed="0"/>
-    <w:lsdException w:name="Medium Grid 2 Accent 2" w:semiHidden="0" w:uiPriority="68" w:unhideWhenUsed="0"/>
-    <w:lsdException w:name="Medium Grid 3 Accent 2" w:semiHidden="0" w:uiPriority="69" w:unhideWhenUsed="0"/>
-    <w:lsdException w:name="Dark List Accent 2" w:semiHidden="0" w:uiPriority="70" w:unhideWhenUsed="0"/>
-    <w:lsdException w:name="Colorful Shading Accent 2" w:semiHidden="0" w:uiPriority="71" w:unhideWhenUsed="0"/>
-    <w:lsdException w:name="Colorful List Accent 2" w:semiHidden="0" w:uiPriority="72" w:unhideWhenUsed="0"/>
-    <w:lsdException w:name="Colorful Grid Accent 2" w:semiHidden="0" w:uiPriority="73" w:unhideWhenUsed="0"/>
-    <w:lsdException w:name="Light Shading Accent 3" w:semiHidden="0" w:uiPriority="60" w:unhideWhenUsed="0"/>
-    <w:lsdException w:name="Light List Accent 3" w:semiHidden="0" w:uiPriority="61" w:unhideWhenUsed="0"/>
-    <w:lsdException w:name="Light Grid Accent 3" w:semiHidden="0" w:uiPriority="62" w:unhideWhenUsed="0"/>
-    <w:lsdException w:name="Medium Shading 1 Accent 3" w:semiHidden="0" w:uiPriority="63" w:unhideWhenUsed="0"/>
-    <w:lsdException w:name="Medium Shading 2 Accent 3" w:semiHidden="0" w:uiPriority="64" w:unhideWhenUsed="0"/>
-    <w:lsdException w:name="Medium List 1 Accent 3" w:semiHidden="0" w:uiPriority="65" w:unhideWhenUsed="0"/>
-    <w:lsdException w:name="Medium List 2 Accent 3" w:semiHidden="0" w:uiPriority="66" w:unhideWhenUsed="0"/>
-    <w:lsdException w:name="Medium Grid 1 Accent 3" w:semiHidden="0" w:uiPriority="67" w:unhideWhenUsed="0"/>
-    <w:lsdException w:name="Medium Grid 2 Accent 3" w:semiHidden="0" w:uiPriority="68" w:unhideWhenUsed="0"/>
-    <w:lsdException w:name="Medium Grid 3 Accent 3" w:semiHidden="0" w:uiPriority="69" w:unhideWhenUsed="0"/>
-    <w:lsdException w:name="Dark List Accent 3" w:semiHidden="0" w:uiPriority="70" w:unhideWhenUsed="0"/>
-    <w:lsdException w:name="Colorful Shading Accent 3" w:semiHidden="0" w:uiPriority="71" w:unhideWhenUsed="0"/>
-    <w:lsdException w:name="Colorful List Accent 3" w:semiHidden="0" w:uiPriority="72" w:unhideWhenUsed="0"/>
-    <w:lsdException w:name="Colorful Grid Accent 3" w:semiHidden="0" w:uiPriority="73" w:unhideWhenUsed="0"/>
-    <w:lsdException w:name="Light Shading Accent 4" w:semiHidden="0" w:uiPriority="60" w:unhideWhenUsed="0"/>
-    <w:lsdException w:name="Light List Accent 4" w:semiHidden="0" w:uiPriority="61" w:unhideWhenUsed="0"/>
-    <w:lsdException w:name="Light Grid Accent 4" w:semiHidden="0" w:uiPriority="62" w:unhideWhenUsed="0"/>
-    <w:lsdException w:name="Medium Shading 1 Accent 4" w:semiHidden="0" w:uiPriority="63" w:unhideWhenUsed="0"/>
-    <w:lsdException w:name="Medium Shading 2 Accent 4" w:semiHidden="0" w:uiPriority="64" w:unhideWhenUsed="0"/>
-    <w:lsdException w:name="Medium List 1 Accent 4" w:semiHidden="0" w:uiPriority="65" w:unhideWhenUsed="0"/>
-    <w:lsdException w:name="Medium List 2 Accent 4" w:semiHidden="0" w:uiPriority="66" w:unhideWhenUsed="0"/>
-    <w:lsdException w:name="Medium Grid 1 Accent 4" w:semiHidden="0" w:uiPriority="67" w:unhideWhenUsed="0"/>
-    <w:lsdException w:name="Medium Grid 2 Accent 4" w:semiHidden="0" w:uiPriority="68" w:unhideWhenUsed="0"/>
-    <w:lsdException w:name="Medium Grid 3 Accent 4" w:semiHidden="0" w:uiPriority="69" w:unhideWhenUsed="0"/>
-    <w:lsdException w:name="Dark List Accent 4" w:semiHidden="0" w:uiPriority="70" w:unhideWhenUsed="0"/>
-    <w:lsdException w:name="Colorful Shading Accent 4" w:semiHidden="0" w:uiPriority="71" w:unhideWhenUsed="0"/>
-    <w:lsdException w:name="Colorful List Accent 4" w:semiHidden="0" w:uiPriority="72" w:unhideWhenUsed="0"/>
-    <w:lsdException w:name="Colorful Grid Accent 4" w:semiHidden="0" w:uiPriority="73" w:unhideWhenUsed="0"/>
-    <w:lsdException w:name="Light Shading Accent 5" w:semiHidden="0" w:uiPriority="60" w:unhideWhenUsed="0"/>
-    <w:lsdException w:name="Light List Accent 5" w:semiHidden="0" w:uiPriority="61" w:unhideWhenUsed="0"/>
-    <w:lsdException w:name="Light Grid Accent 5" w:semiHidden="0" w:uiPriority="62" w:unhideWhenUsed="0"/>
-    <w:lsdException w:name="Medium Shading 1 Accent 5" w:semiHidden="0" w:uiPriority="63" w:unhideWhenUsed="0"/>
-    <w:lsdException w:name="Medium Shading 2 Accent 5" w:semiHidden="0" w:uiPriority="64" w:unhideWhenUsed="0"/>
-    <w:lsdException w:name="Medium List 1 Accent 5" w:semiHidden="0" w:uiPriority="65" w:unhideWhenUsed="0"/>
-    <w:lsdException w:name="Medium List 2 Accent 5" w:semiHidden="0" w:uiPriority="66" w:unhideWhenUsed="0"/>
-    <w:lsdException w:name="Medium Grid 1 Accent 5" w:semiHidden="0" w:uiPriority="67" w:unhideWhenUsed="0"/>
-    <w:lsdException w:name="Medium Grid 2 Accent 5" w:semiHidden="0" w:uiPriority="68" w:unhideWhenUsed="0"/>
-    <w:lsdException w:name="Medium Grid 3 Accent 5" w:semiHidden="0" w:uiPriority="69" w:unhideWhenUsed="0"/>
-    <w:lsdException w:name="Dark List Accent 5" w:semiHidden="0" w:uiPriority="70" w:unhideWhenUsed="0"/>
-    <w:lsdException w:name="Colorful Shading Accent 5" w:semiHidden="0" w:uiPriority="71" w:unhideWhenUsed="0"/>
-    <w:lsdException w:name="Colorful List Accent 5" w:semiHidden="0" w:uiPriority="72" w:unhideWhenUsed="0"/>
-    <w:lsdException w:name="Colorful Grid Accent 5" w:semiHidden="0" w:uiPriority="73" w:unhideWhenUsed="0"/>
-    <w:lsdException w:name="Light Shading Accent 6" w:semiHidden="0" w:uiPriority="60" w:unhideWhenUsed="0"/>
-    <w:lsdException w:name="Light List Accent 6" w:semiHidden="0" w:uiPriority="61" w:unhideWhenUsed="0"/>
-    <w:lsdException w:name="Light Grid Accent 6" w:semiHidden="0" w:uiPriority="62" w:unhideWhenUsed="0"/>
-    <w:lsdException w:name="Medium Shading 1 Accent 6" w:semiHidden="0" w:uiPriority="63" w:unhideWhenUsed="0"/>
-    <w:lsdException w:name="Medium Shading 2 Accent 6" w:semiHidden="0" w:uiPriority="64" w:unhideWhenUsed="0"/>
-    <w:lsdException w:name="Medium List 1 Accent 6" w:semiHidden="0" w:uiPriority="65" w:unhideWhenUsed="0"/>
-    <w:lsdException w:name="Medium List 2 Accent 6" w:semiHidden="0" w:uiPriority="66" w:unhideWhenUsed="0"/>
-    <w:lsdException w:name="Medium Grid 1 Accent 6" w:semiHidden="0" w:uiPriority="67" w:unhideWhenUsed="0"/>
-    <w:lsdException w:name="Medium Grid 2 Accent 6" w:semiHidden="0" w:uiPriority="68" w:unhideWhenUsed="0"/>
-    <w:lsdException w:name="Medium Grid 3 Accent 6" w:semiHidden="0" w:uiPriority="69" w:unhideWhenUsed="0"/>
-    <w:lsdException w:name="Dark List Accent 6" w:semiHidden="0" w:uiPriority="70" w:unhideWhenUsed="0"/>
-    <w:lsdException w:name="Colorful Shading Accent 6" w:semiHidden="0" w:uiPriority="71" w:unhideWhenUsed="0"/>
-    <w:lsdException w:name="Colorful List Accent 6" w:semiHidden="0" w:uiPriority="72" w:unhideWhenUsed="0"/>
-    <w:lsdException w:name="Colorful Grid Accent 6" w:semiHidden="0" w:uiPriority="73" w:unhideWhenUsed="0"/>
-    <w:lsdException w:name="Subtle Emphasis" w:semiHidden="0" w:uiPriority="19" w:unhideWhenUsed="0" w:qFormat="1"/>
-    <w:lsdException w:name="Intense Emphasis" w:semiHidden="0" w:uiPriority="21" w:unhideWhenUsed="0" w:qFormat="1"/>
-    <w:lsdException w:name="Subtle Reference" w:semiHidden="0" w:uiPriority="31" w:unhideWhenUsed="0" w:qFormat="1"/>
-    <w:lsdException w:name="Intense Reference" w:semiHidden="0" w:uiPriority="32" w:unhideWhenUsed="0" w:qFormat="1"/>
-    <w:lsdException w:name="Book Title" w:semiHidden="0" w:uiPriority="33" w:unhideWhenUsed="0" w:qFormat="1"/>
+    <w:lsdException w:name="List Paragraph" w:uiPriority="34" w:semiHidden="0" w:unhideWhenUsed="0" w:qFormat="1"/>
+    <w:lsdException w:name="Quote" w:uiPriority="29" w:semiHidden="0" w:unhideWhenUsed="0" w:qFormat="1"/>
+    <w:lsdException w:name="Intense Quote" w:uiPriority="30" w:semiHidden="0" w:unhideWhenUsed="0" w:qFormat="1"/>
+    <w:lsdException w:name="Medium List 2 Accent 1" w:uiPriority="66" w:semiHidden="0" w:unhideWhenUsed="0"/>
+    <w:lsdException w:name="Medium Grid 1 Accent 1" w:uiPriority="67" w:semiHidden="0" w:unhideWhenUsed="0"/>
+    <w:lsdException w:name="Medium Grid 2 Accent 1" w:uiPriority="68" w:semiHidden="0" w:unhideWhenUsed="0"/>
+    <w:lsdException w:name="Medium Grid 3 Accent 1" w:uiPriority="69" w:semiHidden="0" w:unhideWhenUsed="0"/>
+    <w:lsdException w:name="Dark List Accent 1" w:uiPriority="70" w:semiHidden="0" w:unhideWhenUsed="0"/>
+    <w:lsdException w:name="Colorful Shading Accent 1" w:uiPriority="71" w:semiHidden="0" w:unhideWhenUsed="0"/>
+    <w:lsdException w:name="Colorful List Accent 1" w:uiPriority="72" w:semiHidden="0" w:unhideWhenUsed="0"/>
+    <w:lsdException w:name="Colorful Grid Accent 1" w:uiPriority="73" w:semiHidden="0" w:unhideWhenUsed="0"/>
+    <w:lsdException w:name="Light Shading Accent 2" w:uiPriority="60" w:semiHidden="0" w:unhideWhenUsed="0"/>
+    <w:lsdException w:name="Light List Accent 2" w:uiPriority="61" w:semiHidden="0" w:unhideWhenUsed="0"/>
+    <w:lsdException w:name="Light Grid Accent 2" w:uiPriority="62" w:semiHidden="0" w:unhideWhenUsed="0"/>
+    <w:lsdException w:name="Medium Shading 1 Accent 2" w:uiPriority="63" w:semiHidden="0" w:unhideWhenUsed="0"/>
+    <w:lsdException w:name="Medium Shading 2 Accent 2" w:uiPriority="64" w:semiHidden="0" w:unhideWhenUsed="0"/>
+    <w:lsdException w:name="Medium List 1 Accent 2" w:uiPriority="65" w:semiHidden="0" w:unhideWhenUsed="0"/>
+    <w:lsdException w:name="Medium List 2 Accent 2" w:uiPriority="66" w:semiHidden="0" w:unhideWhenUsed="0"/>
+    <w:lsdException w:name="Medium Grid 1 Accent 2" w:uiPriority="67" w:semiHidden="0" w:unhideWhenUsed="0"/>
+    <w:lsdException w:name="Medium Grid 2 Accent 2" w:uiPriority="68" w:semiHidden="0" w:unhideWhenUsed="0"/>
+    <w:lsdException w:name="Medium Grid 3 Accent 2" w:uiPriority="69" w:semiHidden="0" w:unhideWhenUsed="0"/>
+    <w:lsdException w:name="Dark List Accent 2" w:uiPriority="70" w:semiHidden="0" w:unhideWhenUsed="0"/>
+    <w:lsdException w:name="Colorful Shading Accent 2" w:uiPriority="71" w:semiHidden="0" w:unhideWhenUsed="0"/>
+    <w:lsdException w:name="Colorful List Accent 2" w:uiPriority="72" w:semiHidden="0" w:unhideWhenUsed="0"/>
+    <w:lsdException w:name="Colorful Grid Accent 2" w:uiPriority="73" w:semiHidden="0" w:unhideWhenUsed="0"/>
+    <w:lsdException w:name="Light Shading Accent 3" w:uiPriority="60" w:semiHidden="0" w:unhideWhenUsed="0"/>
+    <w:lsdException w:name="Light List Accent 3" w:uiPriority="61" w:semiHidden="0" w:unhideWhenUsed="0"/>
+    <w:lsdException w:name="Light Grid Accent 3" w:uiPriority="62" w:semiHidden="0" w:unhideWhenUsed="0"/>
+    <w:lsdException w:name="Medium Shading 1 Accent 3" w:uiPriority="63" w:semiHidden="0" w:unhideWhenUsed="0"/>
+    <w:lsdException w:name="Medium Shading 2 Accent 3" w:uiPriority="64" w:semiHidden="0" w:unhideWhenUsed="0"/>
+    <w:lsdException w:name="Medium List 1 Accent 3" w:uiPriority="65" w:semiHidden="0" w:unhideWhenUsed="0"/>
+    <w:lsdException w:name="Medium List 2 Accent 3" w:uiPriority="66" w:semiHidden="0" w:unhideWhenUsed="0"/>
+    <w:lsdException w:name="Medium Grid 1 Accent 3" w:uiPriority="67" w:semiHidden="0" w:unhideWhenUsed="0"/>
+    <w:lsdException w:name="Medium Grid 2 Accent 3" w:uiPriority="68" w:semiHidden="0" w:unhideWhenUsed="0"/>
+    <w:lsdException w:name="Medium Grid 3 Accent 3" w:uiPriority="69" w:semiHidden="0" w:unhideWhenUsed="0"/>
+    <w:lsdException w:name="Dark List Accent 3" w:uiPriority="70" w:semiHidden="0" w:unhideWhenUsed="0"/>
+    <w:lsdException w:name="Colorful Shading Accent 3" w:uiPriority="71" w:semiHidden="0" w:unhideWhenUsed="0"/>
+    <w:lsdException w:name="Colorful List Accent 3" w:uiPriority="72" w:semiHidden="0" w:unhideWhenUsed="0"/>
+    <w:lsdException w:name="Colorful Grid Accent 3" w:uiPriority="73" w:semiHidden="0" w:unhideWhenUsed="0"/>
+    <w:lsdException w:name="Light Shading Accent 4" w:uiPriority="60" w:semiHidden="0" w:unhideWhenUsed="0"/>
+    <w:lsdException w:name="Light List Accent 4" w:uiPriority="61" w:semiHidden="0" w:unhideWhenUsed="0"/>
+    <w:lsdException w:name="Light Grid Accent 4" w:uiPriority="62" w:semiHidden="0" w:unhideWhenUsed="0"/>
+    <w:lsdException w:name="Medium Shading 1 Accent 4" w:uiPriority="63" w:semiHidden="0" w:unhideWhenUsed="0"/>
+    <w:lsdException w:name="Medium Shading 2 Accent 4" w:uiPriority="64" w:semiHidden="0" w:unhideWhenUsed="0"/>
+    <w:lsdException w:name="Medium List 1 Accent 4" w:uiPriority="65" w:semiHidden="0" w:unhideWhenUsed="0"/>
+    <w:lsdException w:name="Medium List 2 Accent 4" w:uiPriority="66" w:semiHidden="0" w:unhideWhenUsed="0"/>
+    <w:lsdException w:name="Medium Grid 1 Accent 4" w:uiPriority="67" w:semiHidden="0" w:unhideWhenUsed="0"/>
+    <w:lsdException w:name="Medium Grid 2 Accent 4" w:uiPriority="68" w:semiHidden="0" w:unhideWhenUsed="0"/>
+    <w:lsdException w:name="Medium Grid 3 Accent 4" w:uiPriority="69" w:semiHidden="0" w:unhideWhenUsed="0"/>
+    <w:lsdException w:name="Dark List Accent 4" w:uiPriority="70" w:semiHidden="0" w:unhideWhenUsed="0"/>
+    <w:lsdException w:name="Colorful Shading Accent 4" w:uiPriority="71" w:semiHidden="0" w:unhideWhenUsed="0"/>
+    <w:lsdException w:name="Colorful List Accent 4" w:uiPriority="72" w:semiHidden="0" w:unhideWhenUsed="0"/>
+    <w:lsdException w:name="Colorful Grid Accent 4" w:uiPriority="73" w:semiHidden="0" w:unhideWhenUsed="0"/>
+    <w:lsdException w:name="Light Shading Accent 5" w:uiPriority="60" w:semiHidden="0" w:unhideWhenUsed="0"/>
+    <w:lsdException w:name="Light List Accent 5" w:uiPriority="61" w:semiHidden="0" w:unhideWhenUsed="0"/>
+    <w:lsdException w:name="Light Grid Accent 5" w:uiPriority="62" w:semiHidden="0" w:unhideWhenUsed="0"/>
+    <w:lsdException w:name="Medium Shading 1 Accent 5" w:uiPriority="63" w:semiHidden="0" w:unhideWhenUsed="0"/>
+    <w:lsdException w:name="Medium Shading 2 Accent 5" w:uiPriority="64" w:semiHidden="0" w:unhideWhenUsed="0"/>
+    <w:lsdException w:name="Medium List 1 Accent 5" w:uiPriority="65" w:semiHidden="0" w:unhideWhenUsed="0"/>
+    <w:lsdException w:name="Medium List 2 Accent 5" w:uiPriority="66" w:semiHidden="0" w:unhideWhenUsed="0"/>
+    <w:lsdException w:name="Medium Grid 1 Accent 5" w:uiPriority="67" w:semiHidden="0" w:unhideWhenUsed="0"/>
+    <w:lsdException w:name="Medium Grid 2 Accent 5" w:uiPriority="68" w:semiHidden="0" w:unhideWhenUsed="0"/>
+    <w:lsdException w:name="Medium Grid 3 Accent 5" w:uiPriority="69" w:semiHidden="0" w:unhideWhenUsed="0"/>
+    <w:lsdException w:name="Dark List Accent 5" w:uiPriority="70" w:semiHidden="0" w:unhideWhenUsed="0"/>
+    <w:lsdException w:name="Colorful Shading Accent 5" w:uiPriority="71" w:semiHidden="0" w:unhideWhenUsed="0"/>
+    <w:lsdException w:name="Colorful List Accent 5" w:uiPriority="72" w:semiHidden="0" w:unhideWhenUsed="0"/>
+    <w:lsdException w:name="Colorful Grid Accent 5" w:uiPriority="73" w:semiHidden="0" w:unhideWhenUsed="0"/>
+    <w:lsdException w:name="Light Shading Accent 6" w:uiPriority="60" w:semiHidden="0" w:unhideWhenUsed="0"/>
+    <w:lsdException w:name="Light List Accent 6" w:uiPriority="61" w:semiHidden="0" w:unhideWhenUsed="0"/>
+    <w:lsdException w:name="Light Grid Accent 6" w:uiPriority="62" w:semiHidden="0" w:unhideWhenUsed="0"/>
+    <w:lsdException w:name="Medium Shading 1 Accent 6" w:uiPriority="63" w:semiHidden="0" w:unhideWhenUsed="0"/>
+    <w:lsdException w:name="Medium Shading 2 Accent 6" w:uiPriority="64" w:semiHidden="0" w:unhideWhenUsed="0"/>
+    <w:lsdException w:name="Medium List 1 Accent 6" w:uiPriority="65" w:semiHidden="0" w:unhideWhenUsed="0"/>
+    <w:lsdException w:name="Medium List 2 Accent 6" w:uiPriority="66" w:semiHidden="0" w:unhideWhenUsed="0"/>
+    <w:lsdException w:name="Medium Grid 1 Accent 6" w:uiPriority="67" w:semiHidden="0" w:unhideWhenUsed="0"/>
+    <w:lsdException w:name="Medium Grid 2 Accent 6" w:uiPriority="68" w:semiHidden="0" w:unhideWhenUsed="0"/>
+    <w:lsdException w:name="Medium Grid 3 Accent 6" w:uiPriority="69" w:semiHidden="0" w:unhideWhenUsed="0"/>
+    <w:lsdException w:name="Dark List Accent 6" w:uiPriority="70" w:semiHidden="0" w:unhideWhenUsed="0"/>
+    <w:lsdException w:name="Colorful Shading Accent 6" w:uiPriority="71" w:semiHidden="0" w:unhideWhenUsed="0"/>
+    <w:lsdException w:name="Colorful List Accent 6" w:uiPriority="72" w:semiHidden="0" w:unhideWhenUsed="0"/>
+    <w:lsdException w:name="Colorful Grid Accent 6" w:uiPriority="73" w:semiHidden="0" w:unhideWhenUsed="0"/>
+    <w:lsdException w:name="Subtle Emphasis" w:uiPriority="19" w:semiHidden="0" w:unhideWhenUsed="0" w:qFormat="1"/>
+    <w:lsdException w:name="Intense Emphasis" w:uiPriority="21" w:semiHidden="0" w:unhideWhenUsed="0" w:qFormat="1"/>
+    <w:lsdException w:name="Subtle Reference" w:uiPriority="31" w:semiHidden="0" w:unhideWhenUsed="0" w:qFormat="1"/>
+    <w:lsdException w:name="Intense Reference" w:uiPriority="32" w:semiHidden="0" w:unhideWhenUsed="0" w:qFormat="1"/>
+    <w:lsdException w:name="Book Title" w:uiPriority="33" w:semiHidden="0" w:unhideWhenUsed="0" w:qFormat="1"/>
     <w:lsdException w:name="Bibliography" w:uiPriority="37"/>
     <w:lsdException w:name="TOC Heading" w:uiPriority="39" w:qFormat="1"/>
   </w:latentStyles>
@@ -33034,7 +33254,7 @@
       <w:keepNext w:val="true"/>
       <w:keepLines w:val="true"/>
       <w:pBdr/>
-      <w:spacing w:after="0" w:before="40"/>
+      <w:spacing w:before="40" w:after="0"/>
       <w:ind/>
       <w:outlineLvl w:val="6"/>
     </w:pPr>
@@ -33369,8 +33589,8 @@
         <w:top w:val="single" w:color="0f4761" w:themeColor="accent1" w:themeShade="BF" w:sz="4" w:space="10"/>
         <w:bottom w:val="single" w:color="0f4761" w:themeColor="accent1" w:themeShade="BF" w:sz="4" w:space="10"/>
       </w:pBdr>
-      <w:spacing w:after="360" w:before="360"/>
-      <w:ind w:right="864" w:left="864"/>
+      <w:spacing w:before="360" w:after="360"/>
+      <w:ind w:left="864" w:right="864"/>
       <w:jc w:val="center"/>
     </w:pPr>
     <w:rPr>
@@ -34054,7 +34274,7 @@
       <w:keepLines w:val="true"/>
       <w:pageBreakBefore w:val="false"/>
       <w:pBdr/>
-      <w:spacing w:after="120" w:before="400"/>
+      <w:spacing w:before="400" w:after="120"/>
       <w:ind/>
     </w:pPr>
     <w:rPr>
@@ -34071,7 +34291,7 @@
       <w:keepLines w:val="true"/>
       <w:pageBreakBefore w:val="false"/>
       <w:pBdr/>
-      <w:spacing w:after="120" w:before="360"/>
+      <w:spacing w:before="360" w:after="120"/>
       <w:ind/>
     </w:pPr>
     <w:rPr>
@@ -34090,7 +34310,7 @@
       <w:keepLines w:val="true"/>
       <w:pageBreakBefore w:val="false"/>
       <w:pBdr/>
-      <w:spacing w:after="80" w:before="320"/>
+      <w:spacing w:before="320" w:after="80"/>
       <w:ind/>
     </w:pPr>
     <w:rPr>
@@ -34110,7 +34330,7 @@
       <w:keepLines w:val="true"/>
       <w:pageBreakBefore w:val="false"/>
       <w:pBdr/>
-      <w:spacing w:after="80" w:before="280"/>
+      <w:spacing w:before="280" w:after="80"/>
       <w:ind/>
     </w:pPr>
     <w:rPr>
@@ -34128,7 +34348,7 @@
       <w:keepLines w:val="true"/>
       <w:pageBreakBefore w:val="false"/>
       <w:pBdr/>
-      <w:spacing w:after="80" w:before="240"/>
+      <w:spacing w:before="240" w:after="80"/>
       <w:ind/>
     </w:pPr>
     <w:rPr>
@@ -34146,7 +34366,7 @@
       <w:keepLines w:val="true"/>
       <w:pageBreakBefore w:val="false"/>
       <w:pBdr/>
-      <w:spacing w:after="80" w:before="240"/>
+      <w:spacing w:before="240" w:after="80"/>
       <w:ind/>
     </w:pPr>
     <w:rPr>
@@ -34166,7 +34386,7 @@
       <w:keepLines w:val="true"/>
       <w:pageBreakBefore w:val="false"/>
       <w:pBdr/>
-      <w:spacing w:after="60" w:before="0"/>
+      <w:spacing w:before="0" w:after="60"/>
       <w:ind/>
     </w:pPr>
     <w:rPr>
@@ -34183,7 +34403,7 @@
       <w:keepLines w:val="true"/>
       <w:pageBreakBefore w:val="false"/>
       <w:pBdr/>
-      <w:spacing w:after="320" w:before="0"/>
+      <w:spacing w:before="0" w:after="320"/>
       <w:ind/>
     </w:pPr>
     <w:rPr>

</xml_diff>